<commit_message>
add sound and doc
</commit_message>
<xml_diff>
--- a/tourist-lastest.docx
+++ b/tourist-lastest.docx
@@ -147,26 +147,9 @@
           <w:szCs w:val="40"/>
           <w:cs/>
         </w:rPr>
-        <w:t>นายกรวิทย์ กอหลัง</w:t>
-      </w:r>
-      <w:r>
-        <w:rPr>
-          <w:rFonts w:ascii="TH SarabunPSK" w:hAnsi="TH SarabunPSK" w:cs="TH SarabunPSK"/>
-          <w:sz w:val="40"/>
-          <w:szCs w:val="40"/>
-        </w:rPr>
-        <w:t xml:space="preserve"> 6610110007</w:t>
-      </w:r>
-    </w:p>
-    <w:p>
-      <w:pPr>
-        <w:jc w:val="center"/>
-        <w:rPr>
-          <w:rFonts w:ascii="TH SarabunPSK" w:hAnsi="TH SarabunPSK" w:cs="TH SarabunPSK"/>
-          <w:sz w:val="40"/>
-          <w:szCs w:val="40"/>
-        </w:rPr>
-      </w:pPr>
+        <w:t>นายกรวิ</w:t>
+      </w:r>
+      <w:proofErr w:type="spellStart"/>
       <w:r>
         <w:rPr>
           <w:rFonts w:ascii="TH SarabunPSK" w:hAnsi="TH SarabunPSK" w:cs="TH SarabunPSK"/>
@@ -174,7 +157,64 @@
           <w:szCs w:val="40"/>
           <w:cs/>
         </w:rPr>
-        <w:t>นายพชรพล ศุกลสกุล 6610110191</w:t>
+        <w:t>ทย์</w:t>
+      </w:r>
+      <w:proofErr w:type="spellEnd"/>
+      <w:r>
+        <w:rPr>
+          <w:rFonts w:ascii="TH SarabunPSK" w:hAnsi="TH SarabunPSK" w:cs="TH SarabunPSK"/>
+          <w:sz w:val="40"/>
+          <w:szCs w:val="40"/>
+          <w:cs/>
+        </w:rPr>
+        <w:t xml:space="preserve"> กอหลัง</w:t>
+      </w:r>
+      <w:r>
+        <w:rPr>
+          <w:rFonts w:ascii="TH SarabunPSK" w:hAnsi="TH SarabunPSK" w:cs="TH SarabunPSK"/>
+          <w:sz w:val="40"/>
+          <w:szCs w:val="40"/>
+        </w:rPr>
+        <w:t xml:space="preserve"> 6610110007</w:t>
+      </w:r>
+    </w:p>
+    <w:p>
+      <w:pPr>
+        <w:jc w:val="center"/>
+        <w:rPr>
+          <w:rFonts w:ascii="TH SarabunPSK" w:hAnsi="TH SarabunPSK" w:cs="TH SarabunPSK"/>
+          <w:sz w:val="40"/>
+          <w:szCs w:val="40"/>
+        </w:rPr>
+      </w:pPr>
+      <w:r>
+        <w:rPr>
+          <w:rFonts w:ascii="TH SarabunPSK" w:hAnsi="TH SarabunPSK" w:cs="TH SarabunPSK"/>
+          <w:sz w:val="40"/>
+          <w:szCs w:val="40"/>
+          <w:cs/>
+        </w:rPr>
+        <w:t xml:space="preserve">นายพชรพล </w:t>
+      </w:r>
+      <w:proofErr w:type="spellStart"/>
+      <w:r>
+        <w:rPr>
+          <w:rFonts w:ascii="TH SarabunPSK" w:hAnsi="TH SarabunPSK" w:cs="TH SarabunPSK"/>
+          <w:sz w:val="40"/>
+          <w:szCs w:val="40"/>
+          <w:cs/>
+        </w:rPr>
+        <w:t>ศุ</w:t>
+      </w:r>
+      <w:proofErr w:type="spellEnd"/>
+      <w:r>
+        <w:rPr>
+          <w:rFonts w:ascii="TH SarabunPSK" w:hAnsi="TH SarabunPSK" w:cs="TH SarabunPSK"/>
+          <w:sz w:val="40"/>
+          <w:szCs w:val="40"/>
+          <w:cs/>
+        </w:rPr>
+        <w:t>กลสกุล 6610110191</w:t>
       </w:r>
     </w:p>
     <w:p>
@@ -934,7 +974,6 @@
               <w:sz w:val="32"/>
               <w:szCs w:val="32"/>
               <w:cs w:val="0"/>
-              <w:lang w:val="th-TH"/>
             </w:rPr>
           </w:pPr>
           <w:r>
@@ -1159,7 +1198,6 @@
               <w:sz w:val="32"/>
               <w:szCs w:val="32"/>
               <w:cs w:val="0"/>
-              <w:lang w:val="th-TH"/>
             </w:rPr>
           </w:pPr>
           <w:r>
@@ -1198,7 +1236,6 @@
               <w:sz w:val="32"/>
               <w:szCs w:val="32"/>
               <w:cs w:val="0"/>
-              <w:lang w:val="th-TH"/>
             </w:rPr>
           </w:pPr>
           <w:r>
@@ -1239,6 +1276,7 @@
               <w:cs w:val="0"/>
             </w:rPr>
           </w:pPr>
+          <w:proofErr w:type="spellStart"/>
           <w:r>
             <w:rPr>
               <w:rFonts w:ascii="TH SarabunPSK" w:hAnsi="TH SarabunPSK" w:cs="TH SarabunPSK"/>
@@ -1248,6 +1286,7 @@
             </w:rPr>
             <w:t>Makefile</w:t>
           </w:r>
+          <w:proofErr w:type="spellEnd"/>
           <w:r>
             <w:rPr>
               <w:rFonts w:ascii="TH SarabunPSK" w:hAnsi="TH SarabunPSK" w:cs="TH SarabunPSK"/>
@@ -2390,47 +2429,3005 @@
     <w:p>
       <w:pPr>
         <w:rPr>
-          <w:rFonts w:ascii="TH SarabunPSK" w:hAnsi="TH SarabunPSK" w:cs="TH SarabunPSK"/>
-          <w:sz w:val="32"/>
-          <w:szCs w:val="32"/>
-        </w:rPr>
-      </w:pPr>
-    </w:p>
-    <w:p>
-      <w:pPr>
-        <w:rPr>
-          <w:rFonts w:ascii="TH SarabunPSK" w:hAnsi="TH SarabunPSK" w:cs="TH SarabunPSK"/>
-          <w:sz w:val="32"/>
-          <w:szCs w:val="32"/>
-        </w:rPr>
-      </w:pPr>
-    </w:p>
-    <w:p>
-      <w:pPr>
-        <w:rPr>
-          <w:rFonts w:ascii="TH SarabunPSK" w:hAnsi="TH SarabunPSK" w:cs="TH SarabunPSK"/>
-          <w:sz w:val="32"/>
-          <w:szCs w:val="32"/>
-        </w:rPr>
-      </w:pPr>
-    </w:p>
-    <w:p>
-      <w:pPr>
-        <w:rPr>
-          <w:rFonts w:ascii="TH SarabunPSK" w:hAnsi="TH SarabunPSK" w:cs="TH SarabunPSK"/>
-          <w:sz w:val="32"/>
-          <w:szCs w:val="32"/>
-        </w:rPr>
-      </w:pPr>
-      <w:r>
-        <w:rPr>
-          <w:rFonts w:ascii="TH SarabunPSK" w:hAnsi="TH SarabunPSK" w:cs="TH SarabunPSK"/>
+          <w:rFonts w:ascii="TH SarabunPSK" w:hAnsi="TH SarabunPSK" w:cs="TH SarabunPSK" w:hint="cs"/>
+          <w:sz w:val="32"/>
+          <w:szCs w:val="32"/>
+        </w:rPr>
+      </w:pPr>
+      <w:r>
+        <w:rPr>
+          <w:rFonts w:ascii="TH SarabunPSK" w:hAnsi="TH SarabunPSK" w:cs="TH SarabunPSK" w:hint="cs"/>
+          <w:b/>
+          <w:bCs/>
           <w:sz w:val="32"/>
           <w:szCs w:val="32"/>
           <w:cs/>
         </w:rPr>
+        <w:t>1</w:t>
+      </w:r>
+      <w:r>
+        <w:rPr>
+          <w:rFonts w:ascii="TH SarabunPSK" w:hAnsi="TH SarabunPSK" w:cs="TH SarabunPSK"/>
+          <w:b/>
+          <w:bCs/>
+          <w:sz w:val="32"/>
+          <w:szCs w:val="32"/>
+          <w:cs/>
+        </w:rPr>
+        <w:t>.</w:t>
+      </w:r>
+      <w:r>
+        <w:rPr>
+          <w:rFonts w:ascii="TH SarabunPSK" w:hAnsi="TH SarabunPSK" w:cs="TH SarabunPSK"/>
+          <w:b/>
+          <w:bCs/>
+          <w:sz w:val="32"/>
+          <w:szCs w:val="32"/>
+          <w:cs/>
+        </w:rPr>
+        <w:t xml:space="preserve"> </w:t>
+      </w:r>
+      <w:r>
+        <w:rPr>
+          <w:rFonts w:ascii="TH SarabunPSK" w:hAnsi="TH SarabunPSK" w:cs="TH SarabunPSK"/>
+          <w:b/>
+          <w:bCs/>
+          <w:sz w:val="32"/>
+          <w:szCs w:val="32"/>
+          <w:cs/>
+        </w:rPr>
+        <w:t>โมดูล</w:t>
+      </w:r>
+      <w:r>
+        <w:rPr>
+          <w:rFonts w:ascii="TH SarabunPSK" w:hAnsi="TH SarabunPSK" w:cs="TH SarabunPSK"/>
+          <w:b/>
+          <w:bCs/>
+          <w:sz w:val="32"/>
+          <w:szCs w:val="32"/>
+        </w:rPr>
+        <w:t xml:space="preserve">PCF8574 </w:t>
+      </w:r>
+      <w:r>
+        <w:rPr>
+          <w:rFonts w:ascii="TH SarabunPSK" w:hAnsi="TH SarabunPSK" w:cs="TH SarabunPSK"/>
+          <w:b/>
+          <w:bCs/>
+          <w:sz w:val="32"/>
+          <w:szCs w:val="32"/>
+          <w:cs/>
+        </w:rPr>
+        <w:t xml:space="preserve">ขยายขา </w:t>
+      </w:r>
+      <w:r>
+        <w:rPr>
+          <w:rFonts w:ascii="TH SarabunPSK" w:hAnsi="TH SarabunPSK" w:cs="TH SarabunPSK"/>
+          <w:b/>
+          <w:bCs/>
+          <w:sz w:val="32"/>
+          <w:szCs w:val="32"/>
+        </w:rPr>
+        <w:t xml:space="preserve">IO 8 </w:t>
+      </w:r>
+      <w:r>
+        <w:rPr>
+          <w:rFonts w:ascii="TH SarabunPSK" w:hAnsi="TH SarabunPSK" w:cs="TH SarabunPSK"/>
+          <w:b/>
+          <w:bCs/>
+          <w:sz w:val="32"/>
+          <w:szCs w:val="32"/>
+          <w:cs/>
+        </w:rPr>
+        <w:t xml:space="preserve">ขา แบบ </w:t>
+      </w:r>
+      <w:r>
+        <w:rPr>
+          <w:rFonts w:ascii="TH SarabunPSK" w:hAnsi="TH SarabunPSK" w:cs="TH SarabunPSK"/>
+          <w:b/>
+          <w:bCs/>
+          <w:sz w:val="32"/>
+          <w:szCs w:val="32"/>
+        </w:rPr>
+        <w:t>I2C</w:t>
+      </w:r>
+      <w:r>
+        <w:rPr>
+          <w:rFonts w:ascii="TH SarabunPSK" w:hAnsi="TH SarabunPSK" w:cs="TH SarabunPSK"/>
+          <w:b/>
+          <w:bCs/>
+          <w:sz w:val="32"/>
+          <w:szCs w:val="32"/>
+        </w:rPr>
+        <w:t xml:space="preserve"> </w:t>
+      </w:r>
+      <w:r>
+        <w:rPr>
+          <w:rFonts w:ascii="TH SarabunPSK" w:hAnsi="TH SarabunPSK" w:cs="TH SarabunPSK"/>
+          <w:sz w:val="32"/>
+          <w:szCs w:val="32"/>
+        </w:rPr>
+        <w:t xml:space="preserve">: </w:t>
+      </w:r>
+      <w:r>
+        <w:rPr>
+          <w:rFonts w:ascii="TH SarabunPSK" w:hAnsi="TH SarabunPSK" w:cs="TH SarabunPSK"/>
+          <w:sz w:val="32"/>
+          <w:szCs w:val="32"/>
+          <w:cs/>
+        </w:rPr>
+        <w:t>ทำหน้าที่ในการขยายพอร์ต</w:t>
+      </w:r>
+      <w:r>
+        <w:rPr>
+          <w:rFonts w:ascii="TH SarabunPSK" w:hAnsi="TH SarabunPSK" w:cs="TH SarabunPSK"/>
+          <w:sz w:val="32"/>
+          <w:szCs w:val="32"/>
+        </w:rPr>
+        <w:t xml:space="preserve"> </w:t>
+      </w:r>
+      <w:r>
+        <w:rPr>
+          <w:rFonts w:ascii="TH SarabunPSK" w:hAnsi="TH SarabunPSK" w:cs="TH SarabunPSK" w:hint="cs"/>
+          <w:sz w:val="32"/>
+          <w:szCs w:val="32"/>
+          <w:cs/>
+        </w:rPr>
+        <w:t xml:space="preserve">ใช้เชื่อมต่อกับ </w:t>
+      </w:r>
+      <w:r>
+        <w:rPr>
+          <w:rFonts w:ascii="TH SarabunPSK" w:hAnsi="TH SarabunPSK" w:cs="TH SarabunPSK"/>
+          <w:sz w:val="32"/>
+          <w:szCs w:val="32"/>
+        </w:rPr>
+        <w:t>Keypad</w:t>
+      </w:r>
+    </w:p>
+    <w:p>
+      <w:pPr>
+        <w:rPr>
+          <w:rFonts w:ascii="TH SarabunPSK" w:hAnsi="TH SarabunPSK" w:cs="TH SarabunPSK"/>
+          <w:sz w:val="32"/>
+          <w:szCs w:val="32"/>
+        </w:rPr>
+      </w:pPr>
+      <w:r>
+        <w:rPr>
+          <w:noProof/>
+        </w:rPr>
+        <w:drawing>
+          <wp:anchor distT="0" distB="0" distL="114300" distR="114300" simplePos="0" relativeHeight="251726848" behindDoc="0" locked="0" layoutInCell="1" allowOverlap="1" wp14:anchorId="41BDE96A" wp14:editId="69F6D6B8">
+            <wp:simplePos x="0" y="0"/>
+            <wp:positionH relativeFrom="margin">
+              <wp:align>center</wp:align>
+            </wp:positionH>
+            <wp:positionV relativeFrom="paragraph">
+              <wp:posOffset>102235</wp:posOffset>
+            </wp:positionV>
+            <wp:extent cx="2133600" cy="1604252"/>
+            <wp:effectExtent l="0" t="0" r="0" b="0"/>
+            <wp:wrapNone/>
+            <wp:docPr id="2" name="รูปภาพ 2" descr="โมดูลPCF8574 ขยายขา IO 8 ขา แบบ I2C ใช้ชิฟ PCF8574 (PCF8574 8Bit Parallel  Expander I2C-Bus)"/>
+            <wp:cNvGraphicFramePr>
+              <a:graphicFrameLocks xmlns:a="http://schemas.openxmlformats.org/drawingml/2006/main" noChangeAspect="1"/>
+            </wp:cNvGraphicFramePr>
+            <a:graphic xmlns:a="http://schemas.openxmlformats.org/drawingml/2006/main">
+              <a:graphicData uri="http://schemas.openxmlformats.org/drawingml/2006/picture">
+                <pic:pic xmlns:pic="http://schemas.openxmlformats.org/drawingml/2006/picture">
+                  <pic:nvPicPr>
+                    <pic:cNvPr id="0" name="Picture 1" descr="โมดูลPCF8574 ขยายขา IO 8 ขา แบบ I2C ใช้ชิฟ PCF8574 (PCF8574 8Bit Parallel  Expander I2C-Bus)"/>
+                    <pic:cNvPicPr>
+                      <a:picLocks noChangeAspect="1" noChangeArrowheads="1"/>
+                    </pic:cNvPicPr>
+                  </pic:nvPicPr>
+                  <pic:blipFill rotWithShape="1">
+                    <a:blip r:embed="rId11" cstate="print">
+                      <a:extLst>
+                        <a:ext uri="{28A0092B-C50C-407E-A947-70E740481C1C}">
+                          <a14:useLocalDpi xmlns:a14="http://schemas.microsoft.com/office/drawing/2010/main" val="0"/>
+                        </a:ext>
+                      </a:extLst>
+                    </a:blip>
+                    <a:srcRect l="10387" t="8230" r="10351" b="16860"/>
+                    <a:stretch/>
+                  </pic:blipFill>
+                  <pic:spPr bwMode="auto">
+                    <a:xfrm>
+                      <a:off x="0" y="0"/>
+                      <a:ext cx="2133600" cy="1604252"/>
+                    </a:xfrm>
+                    <a:prstGeom prst="rect">
+                      <a:avLst/>
+                    </a:prstGeom>
+                    <a:noFill/>
+                    <a:ln>
+                      <a:noFill/>
+                    </a:ln>
+                    <a:extLst>
+                      <a:ext uri="{53640926-AAD7-44D8-BBD7-CCE9431645EC}">
+                        <a14:shadowObscured xmlns:a14="http://schemas.microsoft.com/office/drawing/2010/main"/>
+                      </a:ext>
+                    </a:extLst>
+                  </pic:spPr>
+                </pic:pic>
+              </a:graphicData>
+            </a:graphic>
+            <wp14:sizeRelH relativeFrom="page">
+              <wp14:pctWidth>0</wp14:pctWidth>
+            </wp14:sizeRelH>
+            <wp14:sizeRelV relativeFrom="page">
+              <wp14:pctHeight>0</wp14:pctHeight>
+            </wp14:sizeRelV>
+          </wp:anchor>
+        </w:drawing>
+      </w:r>
+    </w:p>
+    <w:p>
+      <w:pPr>
+        <w:rPr>
+          <w:rFonts w:ascii="TH SarabunPSK" w:hAnsi="TH SarabunPSK" w:cs="TH SarabunPSK"/>
+          <w:sz w:val="32"/>
+          <w:szCs w:val="32"/>
+        </w:rPr>
+      </w:pPr>
+    </w:p>
+    <w:p>
+      <w:pPr>
+        <w:rPr>
+          <w:rFonts w:ascii="TH SarabunPSK" w:hAnsi="TH SarabunPSK" w:cs="TH SarabunPSK"/>
+          <w:sz w:val="32"/>
+          <w:szCs w:val="32"/>
+        </w:rPr>
+      </w:pPr>
+    </w:p>
+    <w:p>
+      <w:pPr>
+        <w:rPr>
+          <w:rFonts w:ascii="TH SarabunPSK" w:hAnsi="TH SarabunPSK" w:cs="TH SarabunPSK"/>
+          <w:sz w:val="32"/>
+          <w:szCs w:val="32"/>
+        </w:rPr>
+      </w:pPr>
+    </w:p>
+    <w:p>
+      <w:pPr>
+        <w:rPr>
+          <w:rFonts w:ascii="TH SarabunPSK" w:hAnsi="TH SarabunPSK" w:cs="TH SarabunPSK"/>
+          <w:sz w:val="32"/>
+          <w:szCs w:val="32"/>
+        </w:rPr>
+      </w:pPr>
+    </w:p>
+    <w:p>
+      <w:pPr>
+        <w:rPr>
+          <w:rFonts w:ascii="TH SarabunPSK" w:hAnsi="TH SarabunPSK" w:cs="TH SarabunPSK"/>
+          <w:sz w:val="32"/>
+          <w:szCs w:val="32"/>
+        </w:rPr>
+      </w:pPr>
+      <w:r>
+        <w:rPr>
+          <w:rFonts w:ascii="TH SarabunPSK" w:hAnsi="TH SarabunPSK" w:cs="TH SarabunPSK"/>
+          <w:b/>
+          <w:bCs/>
+          <w:sz w:val="32"/>
+          <w:szCs w:val="32"/>
+        </w:rPr>
+        <w:t xml:space="preserve">2. </w:t>
+      </w:r>
+      <w:r>
+        <w:rPr>
+          <w:rFonts w:ascii="TH SarabunPSK" w:hAnsi="TH SarabunPSK" w:cs="TH SarabunPSK"/>
+          <w:b/>
+          <w:bCs/>
+          <w:sz w:val="32"/>
+          <w:szCs w:val="32"/>
+        </w:rPr>
+        <w:t>DS</w:t>
+      </w:r>
+      <w:r>
+        <w:rPr>
+          <w:rFonts w:ascii="TH SarabunPSK" w:hAnsi="TH SarabunPSK" w:cs="TH SarabunPSK"/>
+          <w:b/>
+          <w:bCs/>
+          <w:sz w:val="32"/>
+          <w:szCs w:val="32"/>
+          <w:cs/>
+        </w:rPr>
+        <w:t xml:space="preserve">1307 </w:t>
+      </w:r>
+      <w:r>
+        <w:rPr>
+          <w:rFonts w:ascii="TH SarabunPSK" w:hAnsi="TH SarabunPSK" w:cs="TH SarabunPSK"/>
+          <w:b/>
+          <w:bCs/>
+          <w:sz w:val="32"/>
+          <w:szCs w:val="32"/>
+        </w:rPr>
+        <w:t xml:space="preserve">Real Time Clock </w:t>
+      </w:r>
+      <w:proofErr w:type="gramStart"/>
+      <w:r>
+        <w:rPr>
+          <w:rFonts w:ascii="TH SarabunPSK" w:hAnsi="TH SarabunPSK" w:cs="TH SarabunPSK"/>
+          <w:b/>
+          <w:bCs/>
+          <w:sz w:val="32"/>
+          <w:szCs w:val="32"/>
+        </w:rPr>
+        <w:t>Module</w:t>
+      </w:r>
+      <w:r>
+        <w:rPr>
+          <w:rFonts w:ascii="TH SarabunPSK" w:hAnsi="TH SarabunPSK" w:cs="TH SarabunPSK"/>
+          <w:b/>
+          <w:bCs/>
+          <w:sz w:val="32"/>
+          <w:szCs w:val="32"/>
+        </w:rPr>
+        <w:t xml:space="preserve"> :</w:t>
+      </w:r>
+      <w:proofErr w:type="gramEnd"/>
+      <w:r>
+        <w:rPr>
+          <w:rFonts w:ascii="TH SarabunPSK" w:hAnsi="TH SarabunPSK" w:cs="TH SarabunPSK"/>
+          <w:b/>
+          <w:bCs/>
+          <w:sz w:val="32"/>
+          <w:szCs w:val="32"/>
+        </w:rPr>
+        <w:t xml:space="preserve"> </w:t>
+      </w:r>
+      <w:r>
+        <w:rPr>
+          <w:rFonts w:ascii="TH SarabunPSK" w:hAnsi="TH SarabunPSK" w:cs="TH SarabunPSK"/>
+          <w:sz w:val="32"/>
+          <w:szCs w:val="32"/>
+          <w:cs/>
+        </w:rPr>
+        <w:t xml:space="preserve">โมดูลนี้อิงจาก </w:t>
+      </w:r>
+      <w:r>
+        <w:rPr>
+          <w:rFonts w:ascii="TH SarabunPSK" w:hAnsi="TH SarabunPSK" w:cs="TH SarabunPSK"/>
+          <w:sz w:val="32"/>
+          <w:szCs w:val="32"/>
+        </w:rPr>
+        <w:t>DS1307</w:t>
+      </w:r>
+      <w:r>
+        <w:rPr>
+          <w:rFonts w:ascii="TH SarabunPSK" w:hAnsi="TH SarabunPSK" w:cs="TH SarabunPSK"/>
+          <w:sz w:val="32"/>
+          <w:szCs w:val="32"/>
+          <w:cs/>
+        </w:rPr>
+        <w:t xml:space="preserve"> ซึ่งเป็นโมดูลนาฬิกาเรียลไทม์ที่มีความแม่นยำสูง โดยสื่อสารกับไมโครคอนโทรลเลอร์ผ่านทางอินเทอร</w:t>
+      </w:r>
+      <w:proofErr w:type="spellStart"/>
+      <w:r>
+        <w:rPr>
+          <w:rFonts w:ascii="TH SarabunPSK" w:hAnsi="TH SarabunPSK" w:cs="TH SarabunPSK"/>
+          <w:sz w:val="32"/>
+          <w:szCs w:val="32"/>
+          <w:cs/>
+        </w:rPr>
+        <w:t>์เฟซ</w:t>
+      </w:r>
+      <w:proofErr w:type="spellEnd"/>
+      <w:r>
+        <w:rPr>
+          <w:rFonts w:ascii="TH SarabunPSK" w:hAnsi="TH SarabunPSK" w:cs="TH SarabunPSK"/>
+          <w:sz w:val="32"/>
+          <w:szCs w:val="32"/>
+          <w:cs/>
+        </w:rPr>
+        <w:t xml:space="preserve"> </w:t>
+      </w:r>
+      <w:r>
+        <w:rPr>
+          <w:rFonts w:ascii="TH SarabunPSK" w:hAnsi="TH SarabunPSK" w:cs="TH SarabunPSK"/>
+          <w:sz w:val="32"/>
+          <w:szCs w:val="32"/>
+        </w:rPr>
+        <w:t xml:space="preserve">I2C </w:t>
+      </w:r>
+      <w:r>
+        <w:rPr>
+          <w:rFonts w:ascii="TH SarabunPSK" w:hAnsi="TH SarabunPSK" w:cs="TH SarabunPSK"/>
+          <w:sz w:val="32"/>
+          <w:szCs w:val="32"/>
+          <w:cs/>
+        </w:rPr>
+        <w:t>สามารถอ่านข้อมูลปี</w:t>
+      </w:r>
+      <w:r>
+        <w:rPr>
+          <w:rFonts w:ascii="TH SarabunPSK" w:hAnsi="TH SarabunPSK" w:cs="TH SarabunPSK"/>
+          <w:sz w:val="32"/>
+          <w:szCs w:val="32"/>
+        </w:rPr>
+        <w:t xml:space="preserve">, </w:t>
+      </w:r>
+      <w:r>
+        <w:rPr>
+          <w:rFonts w:ascii="TH SarabunPSK" w:hAnsi="TH SarabunPSK" w:cs="TH SarabunPSK"/>
+          <w:sz w:val="32"/>
+          <w:szCs w:val="32"/>
+          <w:cs/>
+        </w:rPr>
+        <w:t>เดือน</w:t>
+      </w:r>
+      <w:r>
+        <w:rPr>
+          <w:rFonts w:ascii="TH SarabunPSK" w:hAnsi="TH SarabunPSK" w:cs="TH SarabunPSK"/>
+          <w:sz w:val="32"/>
+          <w:szCs w:val="32"/>
+        </w:rPr>
+        <w:t xml:space="preserve">, </w:t>
+      </w:r>
+      <w:r>
+        <w:rPr>
+          <w:rFonts w:ascii="TH SarabunPSK" w:hAnsi="TH SarabunPSK" w:cs="TH SarabunPSK"/>
+          <w:sz w:val="32"/>
+          <w:szCs w:val="32"/>
+          <w:cs/>
+        </w:rPr>
+        <w:t>วันที่</w:t>
+      </w:r>
+      <w:r>
+        <w:rPr>
+          <w:rFonts w:ascii="TH SarabunPSK" w:hAnsi="TH SarabunPSK" w:cs="TH SarabunPSK"/>
+          <w:sz w:val="32"/>
+          <w:szCs w:val="32"/>
+        </w:rPr>
+        <w:t xml:space="preserve">, </w:t>
+      </w:r>
+      <w:r>
+        <w:rPr>
+          <w:rFonts w:ascii="TH SarabunPSK" w:hAnsi="TH SarabunPSK" w:cs="TH SarabunPSK"/>
+          <w:sz w:val="32"/>
+          <w:szCs w:val="32"/>
+          <w:cs/>
+        </w:rPr>
+        <w:t>วัน</w:t>
+      </w:r>
+      <w:r>
+        <w:rPr>
+          <w:rFonts w:ascii="TH SarabunPSK" w:hAnsi="TH SarabunPSK" w:cs="TH SarabunPSK"/>
+          <w:sz w:val="32"/>
+          <w:szCs w:val="32"/>
+        </w:rPr>
+        <w:t xml:space="preserve">, </w:t>
+      </w:r>
+      <w:r>
+        <w:rPr>
+          <w:rFonts w:ascii="TH SarabunPSK" w:hAnsi="TH SarabunPSK" w:cs="TH SarabunPSK"/>
+          <w:sz w:val="32"/>
+          <w:szCs w:val="32"/>
+          <w:cs/>
+        </w:rPr>
+        <w:t>ชั่วโมง</w:t>
+      </w:r>
+      <w:r>
+        <w:rPr>
+          <w:rFonts w:ascii="TH SarabunPSK" w:hAnsi="TH SarabunPSK" w:cs="TH SarabunPSK"/>
+          <w:sz w:val="32"/>
+          <w:szCs w:val="32"/>
+        </w:rPr>
+        <w:t xml:space="preserve">, </w:t>
+      </w:r>
+      <w:r>
+        <w:rPr>
+          <w:rFonts w:ascii="TH SarabunPSK" w:hAnsi="TH SarabunPSK" w:cs="TH SarabunPSK"/>
+          <w:sz w:val="32"/>
+          <w:szCs w:val="32"/>
+          <w:cs/>
+        </w:rPr>
+        <w:t>นาที</w:t>
+      </w:r>
+      <w:r>
+        <w:rPr>
+          <w:rFonts w:ascii="TH SarabunPSK" w:hAnsi="TH SarabunPSK" w:cs="TH SarabunPSK"/>
+          <w:sz w:val="32"/>
+          <w:szCs w:val="32"/>
+        </w:rPr>
+        <w:t xml:space="preserve">, </w:t>
+      </w:r>
+      <w:r>
+        <w:rPr>
+          <w:rFonts w:ascii="TH SarabunPSK" w:hAnsi="TH SarabunPSK" w:cs="TH SarabunPSK"/>
+          <w:sz w:val="32"/>
+          <w:szCs w:val="32"/>
+          <w:cs/>
+        </w:rPr>
+        <w:t>และวินาทีได้แบบเรียลไทม์ เมื่อใส่แบตเตอรี่แบบกระดุม แม้ว่าจะปิดการจ่ายไฟให้กับโมดูล นาฬิกาก็จะยังคงทำงานต่อไป</w:t>
+      </w:r>
+    </w:p>
+    <w:p>
+      <w:pPr>
+        <w:rPr>
+          <w:rFonts w:ascii="TH SarabunPSK" w:hAnsi="TH SarabunPSK" w:cs="TH SarabunPSK"/>
+          <w:sz w:val="32"/>
+          <w:szCs w:val="32"/>
+        </w:rPr>
+      </w:pPr>
+      <w:r>
+        <w:rPr>
+          <w:noProof/>
+        </w:rPr>
+        <w:drawing>
+          <wp:anchor distT="0" distB="0" distL="114300" distR="114300" simplePos="0" relativeHeight="251727872" behindDoc="0" locked="0" layoutInCell="1" allowOverlap="1" wp14:anchorId="417D37EE" wp14:editId="7770D2AE">
+            <wp:simplePos x="0" y="0"/>
+            <wp:positionH relativeFrom="column">
+              <wp:posOffset>2004060</wp:posOffset>
+            </wp:positionH>
+            <wp:positionV relativeFrom="paragraph">
+              <wp:posOffset>130175</wp:posOffset>
+            </wp:positionV>
+            <wp:extent cx="2064284" cy="1103269"/>
+            <wp:effectExtent l="0" t="0" r="0" b="1905"/>
+            <wp:wrapNone/>
+            <wp:docPr id="4" name="รูปภาพ 4" descr="Real Time Clock (RTC) Module DS1307 by Catalex v1.1"/>
+            <wp:cNvGraphicFramePr>
+              <a:graphicFrameLocks xmlns:a="http://schemas.openxmlformats.org/drawingml/2006/main" noChangeAspect="1"/>
+            </wp:cNvGraphicFramePr>
+            <a:graphic xmlns:a="http://schemas.openxmlformats.org/drawingml/2006/main">
+              <a:graphicData uri="http://schemas.openxmlformats.org/drawingml/2006/picture">
+                <pic:pic xmlns:pic="http://schemas.openxmlformats.org/drawingml/2006/picture">
+                  <pic:nvPicPr>
+                    <pic:cNvPr id="0" name="Picture 5" descr="Real Time Clock (RTC) Module DS1307 by Catalex v1.1"/>
+                    <pic:cNvPicPr>
+                      <a:picLocks noChangeAspect="1" noChangeArrowheads="1"/>
+                    </pic:cNvPicPr>
+                  </pic:nvPicPr>
+                  <pic:blipFill rotWithShape="1">
+                    <a:blip r:embed="rId12" cstate="print">
+                      <a:extLst>
+                        <a:ext uri="{28A0092B-C50C-407E-A947-70E740481C1C}">
+                          <a14:useLocalDpi xmlns:a14="http://schemas.microsoft.com/office/drawing/2010/main" val="0"/>
+                        </a:ext>
+                      </a:extLst>
+                    </a:blip>
+                    <a:srcRect t="24463" b="22092"/>
+                    <a:stretch/>
+                  </pic:blipFill>
+                  <pic:spPr bwMode="auto">
+                    <a:xfrm>
+                      <a:off x="0" y="0"/>
+                      <a:ext cx="2064284" cy="1103269"/>
+                    </a:xfrm>
+                    <a:prstGeom prst="rect">
+                      <a:avLst/>
+                    </a:prstGeom>
+                    <a:noFill/>
+                    <a:ln>
+                      <a:noFill/>
+                    </a:ln>
+                    <a:extLst>
+                      <a:ext uri="{53640926-AAD7-44D8-BBD7-CCE9431645EC}">
+                        <a14:shadowObscured xmlns:a14="http://schemas.microsoft.com/office/drawing/2010/main"/>
+                      </a:ext>
+                    </a:extLst>
+                  </pic:spPr>
+                </pic:pic>
+              </a:graphicData>
+            </a:graphic>
+            <wp14:sizeRelH relativeFrom="page">
+              <wp14:pctWidth>0</wp14:pctWidth>
+            </wp14:sizeRelH>
+            <wp14:sizeRelV relativeFrom="page">
+              <wp14:pctHeight>0</wp14:pctHeight>
+            </wp14:sizeRelV>
+          </wp:anchor>
+        </w:drawing>
+      </w:r>
+    </w:p>
+    <w:p>
+      <w:pPr>
+        <w:rPr>
+          <w:rFonts w:ascii="TH SarabunPSK" w:hAnsi="TH SarabunPSK" w:cs="TH SarabunPSK"/>
+          <w:sz w:val="32"/>
+          <w:szCs w:val="32"/>
+        </w:rPr>
+      </w:pPr>
+    </w:p>
+    <w:p>
+      <w:pPr>
+        <w:rPr>
+          <w:rFonts w:ascii="TH SarabunPSK" w:hAnsi="TH SarabunPSK" w:cs="TH SarabunPSK"/>
+          <w:sz w:val="32"/>
+          <w:szCs w:val="32"/>
+        </w:rPr>
+      </w:pPr>
+    </w:p>
+    <w:p>
+      <w:pPr>
+        <w:rPr>
+          <w:rFonts w:ascii="TH SarabunPSK" w:hAnsi="TH SarabunPSK" w:cs="TH SarabunPSK"/>
+          <w:sz w:val="32"/>
+          <w:szCs w:val="32"/>
+        </w:rPr>
+      </w:pPr>
+    </w:p>
+    <w:p>
+      <w:pPr>
+        <w:rPr>
+          <w:rFonts w:ascii="TH SarabunPSK" w:hAnsi="TH SarabunPSK" w:cs="TH SarabunPSK" w:hint="cs"/>
+          <w:sz w:val="32"/>
+          <w:szCs w:val="32"/>
+        </w:rPr>
+      </w:pPr>
+      <w:r>
+        <w:rPr>
+          <w:rFonts w:ascii="TH SarabunPSK" w:hAnsi="TH SarabunPSK" w:cs="TH SarabunPSK"/>
+          <w:b/>
+          <w:bCs/>
+          <w:sz w:val="32"/>
+          <w:szCs w:val="32"/>
+        </w:rPr>
+        <w:t xml:space="preserve">3. </w:t>
+      </w:r>
+      <w:r>
+        <w:rPr>
+          <w:rFonts w:ascii="TH SarabunPSK" w:hAnsi="TH SarabunPSK" w:cs="TH SarabunPSK"/>
+          <w:b/>
+          <w:bCs/>
+          <w:sz w:val="32"/>
+          <w:szCs w:val="32"/>
+        </w:rPr>
+        <w:t>Odroid-C</w:t>
+      </w:r>
+      <w:proofErr w:type="gramStart"/>
+      <w:r>
+        <w:rPr>
+          <w:rFonts w:ascii="TH SarabunPSK" w:hAnsi="TH SarabunPSK" w:cs="TH SarabunPSK"/>
+          <w:b/>
+          <w:bCs/>
+          <w:sz w:val="32"/>
+          <w:szCs w:val="32"/>
+        </w:rPr>
+        <w:t>4</w:t>
+      </w:r>
+      <w:r>
+        <w:rPr>
+          <w:rFonts w:ascii="TH SarabunPSK" w:hAnsi="TH SarabunPSK" w:cs="TH SarabunPSK"/>
+          <w:b/>
+          <w:bCs/>
+          <w:sz w:val="32"/>
+          <w:szCs w:val="32"/>
+        </w:rPr>
+        <w:t xml:space="preserve"> :</w:t>
+      </w:r>
+      <w:proofErr w:type="gramEnd"/>
+      <w:r>
+        <w:rPr>
+          <w:rFonts w:ascii="TH SarabunPSK" w:hAnsi="TH SarabunPSK" w:cs="TH SarabunPSK"/>
+          <w:b/>
+          <w:bCs/>
+          <w:sz w:val="32"/>
+          <w:szCs w:val="32"/>
+        </w:rPr>
+        <w:t xml:space="preserve"> </w:t>
+      </w:r>
+    </w:p>
+    <w:p>
+      <w:pPr>
+        <w:rPr>
+          <w:rFonts w:ascii="TH SarabunPSK" w:hAnsi="TH SarabunPSK" w:cs="TH SarabunPSK"/>
+          <w:sz w:val="32"/>
+          <w:szCs w:val="32"/>
+        </w:rPr>
+      </w:pPr>
+      <w:r>
+        <w:rPr>
+          <w:noProof/>
+        </w:rPr>
+        <w:drawing>
+          <wp:anchor distT="0" distB="0" distL="114300" distR="114300" simplePos="0" relativeHeight="251728896" behindDoc="0" locked="0" layoutInCell="1" allowOverlap="1" wp14:anchorId="48BC5EC1" wp14:editId="23529DE7">
+            <wp:simplePos x="0" y="0"/>
+            <wp:positionH relativeFrom="margin">
+              <wp:align>center</wp:align>
+            </wp:positionH>
+            <wp:positionV relativeFrom="paragraph">
+              <wp:posOffset>83185</wp:posOffset>
+            </wp:positionV>
+            <wp:extent cx="2369820" cy="1526640"/>
+            <wp:effectExtent l="0" t="0" r="0" b="0"/>
+            <wp:wrapNone/>
+            <wp:docPr id="5" name="รูปภาพ 5" descr="ODROID-C4 – ODROID"/>
+            <wp:cNvGraphicFramePr>
+              <a:graphicFrameLocks xmlns:a="http://schemas.openxmlformats.org/drawingml/2006/main" noChangeAspect="1"/>
+            </wp:cNvGraphicFramePr>
+            <a:graphic xmlns:a="http://schemas.openxmlformats.org/drawingml/2006/main">
+              <a:graphicData uri="http://schemas.openxmlformats.org/drawingml/2006/picture">
+                <pic:pic xmlns:pic="http://schemas.openxmlformats.org/drawingml/2006/picture">
+                  <pic:nvPicPr>
+                    <pic:cNvPr id="0" name="Picture 7" descr="ODROID-C4 – ODROID"/>
+                    <pic:cNvPicPr>
+                      <a:picLocks noChangeAspect="1" noChangeArrowheads="1"/>
+                    </pic:cNvPicPr>
+                  </pic:nvPicPr>
+                  <pic:blipFill>
+                    <a:blip r:embed="rId13">
+                      <a:extLst>
+                        <a:ext uri="{28A0092B-C50C-407E-A947-70E740481C1C}">
+                          <a14:useLocalDpi xmlns:a14="http://schemas.microsoft.com/office/drawing/2010/main" val="0"/>
+                        </a:ext>
+                      </a:extLst>
+                    </a:blip>
+                    <a:srcRect/>
+                    <a:stretch>
+                      <a:fillRect/>
+                    </a:stretch>
+                  </pic:blipFill>
+                  <pic:spPr bwMode="auto">
+                    <a:xfrm>
+                      <a:off x="0" y="0"/>
+                      <a:ext cx="2369820" cy="1526640"/>
+                    </a:xfrm>
+                    <a:prstGeom prst="rect">
+                      <a:avLst/>
+                    </a:prstGeom>
+                    <a:noFill/>
+                    <a:ln>
+                      <a:noFill/>
+                    </a:ln>
+                  </pic:spPr>
+                </pic:pic>
+              </a:graphicData>
+            </a:graphic>
+            <wp14:sizeRelH relativeFrom="page">
+              <wp14:pctWidth>0</wp14:pctWidth>
+            </wp14:sizeRelH>
+            <wp14:sizeRelV relativeFrom="page">
+              <wp14:pctHeight>0</wp14:pctHeight>
+            </wp14:sizeRelV>
+          </wp:anchor>
+        </w:drawing>
+      </w:r>
+    </w:p>
+    <w:p>
+      <w:pPr>
+        <w:rPr>
+          <w:rFonts w:ascii="TH SarabunPSK" w:hAnsi="TH SarabunPSK" w:cs="TH SarabunPSK"/>
+          <w:sz w:val="32"/>
+          <w:szCs w:val="32"/>
+        </w:rPr>
+      </w:pPr>
+    </w:p>
+    <w:p>
+      <w:pPr>
+        <w:rPr>
+          <w:rFonts w:ascii="TH SarabunPSK" w:hAnsi="TH SarabunPSK" w:cs="TH SarabunPSK"/>
+          <w:sz w:val="32"/>
+          <w:szCs w:val="32"/>
+        </w:rPr>
+      </w:pPr>
+    </w:p>
+    <w:p>
+      <w:pPr>
+        <w:rPr>
+          <w:rFonts w:ascii="TH SarabunPSK" w:hAnsi="TH SarabunPSK" w:cs="TH SarabunPSK"/>
+          <w:sz w:val="32"/>
+          <w:szCs w:val="32"/>
+        </w:rPr>
+      </w:pPr>
+    </w:p>
+    <w:p>
+      <w:pPr>
+        <w:rPr>
+          <w:rFonts w:ascii="TH SarabunPSK" w:hAnsi="TH SarabunPSK" w:cs="TH SarabunPSK"/>
+          <w:sz w:val="32"/>
+          <w:szCs w:val="32"/>
+        </w:rPr>
+      </w:pPr>
+    </w:p>
+    <w:p>
+      <w:pPr>
+        <w:rPr>
+          <w:rFonts w:ascii="TH SarabunPSK" w:hAnsi="TH SarabunPSK" w:cs="TH SarabunPSK"/>
+          <w:sz w:val="32"/>
+          <w:szCs w:val="32"/>
+        </w:rPr>
+      </w:pPr>
+    </w:p>
+    <w:p>
+      <w:pPr>
+        <w:rPr>
+          <w:rFonts w:ascii="TH SarabunPSK" w:hAnsi="TH SarabunPSK" w:cs="TH SarabunPSK"/>
+          <w:sz w:val="32"/>
+          <w:szCs w:val="32"/>
+        </w:rPr>
+      </w:pPr>
+      <w:r>
+        <w:rPr>
+          <w:rFonts w:ascii="TH SarabunPSK" w:hAnsi="TH SarabunPSK" w:cs="TH SarabunPSK"/>
+          <w:sz w:val="32"/>
+          <w:szCs w:val="32"/>
+        </w:rPr>
+        <w:lastRenderedPageBreak/>
+        <w:drawing>
+          <wp:anchor distT="0" distB="0" distL="114300" distR="114300" simplePos="0" relativeHeight="251730944" behindDoc="1" locked="0" layoutInCell="1" allowOverlap="1" wp14:anchorId="53BB8C62" wp14:editId="6059FAC1">
+            <wp:simplePos x="0" y="0"/>
+            <wp:positionH relativeFrom="column">
+              <wp:posOffset>1630680</wp:posOffset>
+            </wp:positionH>
+            <wp:positionV relativeFrom="paragraph">
+              <wp:posOffset>1958340</wp:posOffset>
+            </wp:positionV>
+            <wp:extent cx="2156460" cy="1490179"/>
+            <wp:effectExtent l="0" t="0" r="0" b="0"/>
+            <wp:wrapNone/>
+            <wp:docPr id="7" name="รูปภาพ 7"/>
+            <wp:cNvGraphicFramePr>
+              <a:graphicFrameLocks xmlns:a="http://schemas.openxmlformats.org/drawingml/2006/main" noChangeAspect="1"/>
+            </wp:cNvGraphicFramePr>
+            <a:graphic xmlns:a="http://schemas.openxmlformats.org/drawingml/2006/main">
+              <a:graphicData uri="http://schemas.openxmlformats.org/drawingml/2006/picture">
+                <pic:pic xmlns:pic="http://schemas.openxmlformats.org/drawingml/2006/picture">
+                  <pic:nvPicPr>
+                    <pic:cNvPr id="1" name=""/>
+                    <pic:cNvPicPr/>
+                  </pic:nvPicPr>
+                  <pic:blipFill>
+                    <a:blip r:embed="rId14"/>
+                    <a:stretch>
+                      <a:fillRect/>
+                    </a:stretch>
+                  </pic:blipFill>
+                  <pic:spPr>
+                    <a:xfrm>
+                      <a:off x="0" y="0"/>
+                      <a:ext cx="2156460" cy="1490179"/>
+                    </a:xfrm>
+                    <a:prstGeom prst="rect">
+                      <a:avLst/>
+                    </a:prstGeom>
+                  </pic:spPr>
+                </pic:pic>
+              </a:graphicData>
+            </a:graphic>
+            <wp14:sizeRelH relativeFrom="margin">
+              <wp14:pctWidth>0</wp14:pctWidth>
+            </wp14:sizeRelH>
+            <wp14:sizeRelV relativeFrom="margin">
+              <wp14:pctHeight>0</wp14:pctHeight>
+            </wp14:sizeRelV>
+          </wp:anchor>
+        </w:drawing>
+      </w:r>
+      <w:r>
+        <w:rPr>
+          <w:rFonts w:ascii="TH SarabunPSK" w:hAnsi="TH SarabunPSK" w:cs="TH SarabunPSK"/>
+          <w:b/>
+          <w:bCs/>
+          <w:sz w:val="32"/>
+          <w:szCs w:val="32"/>
+        </w:rPr>
+        <w:t>4.</w:t>
+      </w:r>
+      <w:r>
+        <w:rPr>
+          <w:b/>
+          <w:bCs/>
+        </w:rPr>
+        <w:t xml:space="preserve"> </w:t>
+      </w:r>
+      <w:r>
+        <w:rPr>
+          <w:rFonts w:ascii="TH SarabunPSK" w:hAnsi="TH SarabunPSK" w:cs="TH SarabunPSK"/>
+          <w:b/>
+          <w:bCs/>
+          <w:sz w:val="32"/>
+          <w:szCs w:val="32"/>
+        </w:rPr>
+        <w:t>Arduino Uno R3</w:t>
+      </w:r>
+      <w:r>
+        <w:rPr>
+          <w:rFonts w:ascii="TH SarabunPSK" w:hAnsi="TH SarabunPSK" w:cs="TH SarabunPSK"/>
+          <w:b/>
+          <w:bCs/>
+          <w:sz w:val="32"/>
+          <w:szCs w:val="32"/>
+        </w:rPr>
+        <w:t xml:space="preserve"> : </w:t>
+      </w:r>
+      <w:r>
+        <w:rPr>
+          <w:rFonts w:ascii="TH SarabunPSK" w:hAnsi="TH SarabunPSK" w:cs="TH SarabunPSK"/>
+          <w:sz w:val="32"/>
+          <w:szCs w:val="32"/>
+          <w:cs/>
+        </w:rPr>
+        <w:t xml:space="preserve">เป็นบอร์ดมาตรฐานที่นิยมใช้งานมากที่สุด เนื่องจากเป็นขนาดที่เหมาะสาหรับการเริ่มต้นเรียนรู้ </w:t>
+      </w:r>
+      <w:r>
+        <w:rPr>
+          <w:rFonts w:ascii="TH SarabunPSK" w:hAnsi="TH SarabunPSK" w:cs="TH SarabunPSK"/>
+          <w:sz w:val="32"/>
+          <w:szCs w:val="32"/>
+        </w:rPr>
+        <w:t>Arduino</w:t>
+      </w:r>
+      <w:r>
+        <w:rPr>
+          <w:rFonts w:ascii="TH SarabunPSK" w:hAnsi="TH SarabunPSK" w:cs="TH SarabunPSK"/>
+          <w:sz w:val="32"/>
+          <w:szCs w:val="32"/>
+        </w:rPr>
+        <w:t xml:space="preserve"> </w:t>
+      </w:r>
+      <w:r>
+        <w:rPr>
+          <w:rFonts w:ascii="TH SarabunPSK" w:hAnsi="TH SarabunPSK" w:cs="TH SarabunPSK"/>
+          <w:sz w:val="32"/>
+          <w:szCs w:val="32"/>
+          <w:cs/>
+        </w:rPr>
+        <w:t xml:space="preserve">และมี </w:t>
+      </w:r>
+      <w:r>
+        <w:rPr>
+          <w:rFonts w:ascii="TH SarabunPSK" w:hAnsi="TH SarabunPSK" w:cs="TH SarabunPSK"/>
+          <w:sz w:val="32"/>
+          <w:szCs w:val="32"/>
+        </w:rPr>
+        <w:t xml:space="preserve">Shields </w:t>
+      </w:r>
+      <w:r>
+        <w:rPr>
+          <w:rFonts w:ascii="TH SarabunPSK" w:hAnsi="TH SarabunPSK" w:cs="TH SarabunPSK"/>
+          <w:sz w:val="32"/>
+          <w:szCs w:val="32"/>
+          <w:cs/>
+        </w:rPr>
+        <w:t xml:space="preserve">ให้เลือกใช้งานได้มากกว่าบอร์ด </w:t>
+      </w:r>
+      <w:r>
+        <w:rPr>
+          <w:rFonts w:ascii="TH SarabunPSK" w:hAnsi="TH SarabunPSK" w:cs="TH SarabunPSK"/>
+          <w:sz w:val="32"/>
+          <w:szCs w:val="32"/>
+        </w:rPr>
+        <w:t xml:space="preserve">Arduino </w:t>
+      </w:r>
+      <w:r>
+        <w:rPr>
+          <w:rFonts w:ascii="TH SarabunPSK" w:hAnsi="TH SarabunPSK" w:cs="TH SarabunPSK"/>
+          <w:sz w:val="32"/>
+          <w:szCs w:val="32"/>
+          <w:cs/>
+        </w:rPr>
+        <w:t>รุ่นอื่นๆ ที่ออกแบบมาเฉพาะมากกว่า โดยบอร์ด</w:t>
+      </w:r>
+      <w:r>
+        <w:rPr>
+          <w:rFonts w:ascii="TH SarabunPSK" w:hAnsi="TH SarabunPSK" w:cs="TH SarabunPSK"/>
+          <w:sz w:val="32"/>
+          <w:szCs w:val="32"/>
+        </w:rPr>
+        <w:t xml:space="preserve"> </w:t>
+      </w:r>
+      <w:r>
+        <w:rPr>
+          <w:rFonts w:ascii="TH SarabunPSK" w:hAnsi="TH SarabunPSK" w:cs="TH SarabunPSK"/>
+          <w:sz w:val="32"/>
+          <w:szCs w:val="32"/>
+        </w:rPr>
+        <w:t xml:space="preserve">Arduino Uno </w:t>
+      </w:r>
+      <w:r>
+        <w:rPr>
+          <w:rFonts w:ascii="TH SarabunPSK" w:hAnsi="TH SarabunPSK" w:cs="TH SarabunPSK"/>
+          <w:sz w:val="32"/>
+          <w:szCs w:val="32"/>
+          <w:cs/>
+        </w:rPr>
+        <w:t xml:space="preserve">ได้มีการพัฒนาเรื่อยมา ตั้งแต่ </w:t>
+      </w:r>
+      <w:r>
+        <w:rPr>
+          <w:rFonts w:ascii="TH SarabunPSK" w:hAnsi="TH SarabunPSK" w:cs="TH SarabunPSK"/>
+          <w:sz w:val="32"/>
+          <w:szCs w:val="32"/>
+        </w:rPr>
+        <w:t>R2 R3</w:t>
+      </w:r>
+      <w:r>
+        <w:rPr>
+          <w:rFonts w:ascii="TH SarabunPSK" w:hAnsi="TH SarabunPSK" w:cs="TH SarabunPSK"/>
+          <w:sz w:val="32"/>
+          <w:szCs w:val="32"/>
+          <w:cs/>
+        </w:rPr>
+        <w:t xml:space="preserve"> และรุ่นย่อยที่เปลี่ยนชิปไอซีเป็นแบบ </w:t>
+      </w:r>
+      <w:r>
+        <w:rPr>
+          <w:rFonts w:ascii="TH SarabunPSK" w:hAnsi="TH SarabunPSK" w:cs="TH SarabunPSK"/>
+          <w:sz w:val="32"/>
+          <w:szCs w:val="32"/>
+        </w:rPr>
+        <w:t xml:space="preserve">SMD </w:t>
+      </w:r>
+      <w:r>
+        <w:rPr>
+          <w:rFonts w:ascii="TH SarabunPSK" w:hAnsi="TH SarabunPSK" w:cs="TH SarabunPSK"/>
+          <w:sz w:val="32"/>
+          <w:szCs w:val="32"/>
+          <w:cs/>
+        </w:rPr>
+        <w:t>เป็นบอร์ด</w:t>
+      </w:r>
+      <w:r>
+        <w:rPr>
+          <w:rFonts w:ascii="TH SarabunPSK" w:hAnsi="TH SarabunPSK" w:cs="TH SarabunPSK"/>
+          <w:sz w:val="32"/>
+          <w:szCs w:val="32"/>
+        </w:rPr>
+        <w:t xml:space="preserve"> </w:t>
+      </w:r>
+      <w:r>
+        <w:rPr>
+          <w:rFonts w:ascii="TH SarabunPSK" w:hAnsi="TH SarabunPSK" w:cs="TH SarabunPSK"/>
+          <w:sz w:val="32"/>
+          <w:szCs w:val="32"/>
+        </w:rPr>
+        <w:t xml:space="preserve">Arduino </w:t>
+      </w:r>
+      <w:r>
+        <w:rPr>
+          <w:rFonts w:ascii="TH SarabunPSK" w:hAnsi="TH SarabunPSK" w:cs="TH SarabunPSK"/>
+          <w:sz w:val="32"/>
+          <w:szCs w:val="32"/>
+          <w:cs/>
+        </w:rPr>
+        <w:t xml:space="preserve">ที่ได้รับความนิยมมากที่สุด เนื่องจากราคาไม่แพง และส่วนใหญ่โปรเจคและ </w:t>
+      </w:r>
+      <w:r>
+        <w:rPr>
+          <w:rFonts w:ascii="TH SarabunPSK" w:hAnsi="TH SarabunPSK" w:cs="TH SarabunPSK"/>
+          <w:sz w:val="32"/>
+          <w:szCs w:val="32"/>
+        </w:rPr>
+        <w:t xml:space="preserve">Library </w:t>
+      </w:r>
+      <w:r>
+        <w:rPr>
+          <w:rFonts w:ascii="TH SarabunPSK" w:hAnsi="TH SarabunPSK" w:cs="TH SarabunPSK"/>
+          <w:sz w:val="32"/>
+          <w:szCs w:val="32"/>
+          <w:cs/>
+        </w:rPr>
+        <w:t xml:space="preserve">ต่างๆ ที่พัฒนาขึ้นมา </w:t>
+      </w:r>
+      <w:r>
+        <w:rPr>
+          <w:rFonts w:ascii="TH SarabunPSK" w:hAnsi="TH SarabunPSK" w:cs="TH SarabunPSK"/>
+          <w:sz w:val="32"/>
+          <w:szCs w:val="32"/>
+        </w:rPr>
+        <w:t xml:space="preserve">Support </w:t>
+      </w:r>
+      <w:r>
+        <w:rPr>
+          <w:rFonts w:ascii="TH SarabunPSK" w:hAnsi="TH SarabunPSK" w:cs="TH SarabunPSK"/>
+          <w:sz w:val="32"/>
+          <w:szCs w:val="32"/>
+          <w:cs/>
+        </w:rPr>
+        <w:t xml:space="preserve">จะอ้างอิงกับบอร์ดนี้เป็นหลัก และข้อดีอีกอย่างคือกรณีที่ </w:t>
+      </w:r>
+      <w:r>
+        <w:rPr>
+          <w:rFonts w:ascii="TH SarabunPSK" w:hAnsi="TH SarabunPSK" w:cs="TH SarabunPSK"/>
+          <w:sz w:val="32"/>
+          <w:szCs w:val="32"/>
+        </w:rPr>
+        <w:t xml:space="preserve">MCU </w:t>
+      </w:r>
+      <w:r>
+        <w:rPr>
+          <w:rFonts w:ascii="TH SarabunPSK" w:hAnsi="TH SarabunPSK" w:cs="TH SarabunPSK"/>
+          <w:sz w:val="32"/>
+          <w:szCs w:val="32"/>
+          <w:cs/>
+        </w:rPr>
+        <w:t xml:space="preserve">เสียผู้ใช้งานสามารถซื้อมาเปลี่ยนเองได้ง่าย </w:t>
+      </w:r>
+      <w:r>
+        <w:rPr>
+          <w:rFonts w:ascii="TH SarabunPSK" w:hAnsi="TH SarabunPSK" w:cs="TH SarabunPSK"/>
+          <w:sz w:val="32"/>
+          <w:szCs w:val="32"/>
+        </w:rPr>
+        <w:t>Arduino Uno R3</w:t>
+      </w:r>
+      <w:r>
+        <w:rPr>
+          <w:rFonts w:ascii="TH SarabunPSK" w:hAnsi="TH SarabunPSK" w:cs="TH SarabunPSK"/>
+          <w:sz w:val="32"/>
+          <w:szCs w:val="32"/>
+          <w:cs/>
+        </w:rPr>
+        <w:t xml:space="preserve"> มี </w:t>
+      </w:r>
+      <w:r>
+        <w:rPr>
+          <w:rFonts w:ascii="TH SarabunPSK" w:hAnsi="TH SarabunPSK" w:cs="TH SarabunPSK"/>
+          <w:sz w:val="32"/>
+          <w:szCs w:val="32"/>
+        </w:rPr>
+        <w:t xml:space="preserve">MCU </w:t>
+      </w:r>
+      <w:r>
+        <w:rPr>
+          <w:rFonts w:ascii="TH SarabunPSK" w:hAnsi="TH SarabunPSK" w:cs="TH SarabunPSK"/>
+          <w:sz w:val="32"/>
+          <w:szCs w:val="32"/>
+          <w:cs/>
+        </w:rPr>
+        <w:t xml:space="preserve">ที่เป็น </w:t>
+      </w:r>
+      <w:r>
+        <w:rPr>
+          <w:rFonts w:ascii="TH SarabunPSK" w:hAnsi="TH SarabunPSK" w:cs="TH SarabunPSK"/>
+          <w:sz w:val="32"/>
+          <w:szCs w:val="32"/>
+        </w:rPr>
+        <w:t>Package DIP</w:t>
+      </w:r>
+      <w:r>
+        <w:rPr>
+          <w:rFonts w:ascii="TH SarabunPSK" w:hAnsi="TH SarabunPSK" w:cs="TH SarabunPSK"/>
+          <w:sz w:val="32"/>
+          <w:szCs w:val="32"/>
+        </w:rPr>
+        <w:cr/>
+      </w:r>
+    </w:p>
+    <w:p>
+      <w:pPr>
+        <w:rPr>
+          <w:rFonts w:ascii="TH SarabunPSK" w:hAnsi="TH SarabunPSK" w:cs="TH SarabunPSK"/>
+          <w:sz w:val="32"/>
+          <w:szCs w:val="32"/>
+        </w:rPr>
+      </w:pPr>
+    </w:p>
+    <w:p>
+      <w:pPr>
+        <w:rPr>
+          <w:rFonts w:ascii="TH SarabunPSK" w:hAnsi="TH SarabunPSK" w:cs="TH SarabunPSK"/>
+          <w:sz w:val="32"/>
+          <w:szCs w:val="32"/>
+        </w:rPr>
+      </w:pPr>
+    </w:p>
+    <w:p>
+      <w:pPr>
+        <w:rPr>
+          <w:rFonts w:ascii="TH SarabunPSK" w:hAnsi="TH SarabunPSK" w:cs="TH SarabunPSK"/>
+          <w:sz w:val="32"/>
+          <w:szCs w:val="32"/>
+        </w:rPr>
+      </w:pPr>
+    </w:p>
+    <w:p>
+      <w:pPr>
+        <w:rPr>
+          <w:rFonts w:ascii="TH SarabunPSK" w:hAnsi="TH SarabunPSK" w:cs="TH SarabunPSK"/>
+          <w:sz w:val="32"/>
+          <w:szCs w:val="32"/>
+        </w:rPr>
+      </w:pPr>
+    </w:p>
+    <w:p>
+      <w:pPr>
+        <w:rPr>
+          <w:rFonts w:ascii="TH SarabunPSK" w:hAnsi="TH SarabunPSK" w:cs="TH SarabunPSK"/>
+          <w:sz w:val="32"/>
+          <w:szCs w:val="32"/>
+        </w:rPr>
+      </w:pPr>
+    </w:p>
+    <w:p>
+      <w:pPr>
+        <w:rPr>
+          <w:rFonts w:ascii="TH SarabunPSK" w:hAnsi="TH SarabunPSK" w:cs="TH SarabunPSK"/>
+          <w:sz w:val="32"/>
+          <w:szCs w:val="32"/>
+        </w:rPr>
+      </w:pPr>
+      <w:r>
+        <w:rPr>
+          <w:rFonts w:ascii="TH SarabunPSK" w:hAnsi="TH SarabunPSK" w:cs="TH SarabunPSK"/>
+          <w:b/>
+          <w:bCs/>
+          <w:sz w:val="32"/>
+          <w:szCs w:val="32"/>
+        </w:rPr>
+        <w:t>5.</w:t>
+      </w:r>
+      <w:r>
+        <w:rPr>
+          <w:b/>
+          <w:bCs/>
+        </w:rPr>
+        <w:t xml:space="preserve"> </w:t>
+      </w:r>
+      <w:r>
+        <w:rPr>
+          <w:rFonts w:ascii="TH SarabunPSK" w:hAnsi="TH SarabunPSK" w:cs="TH SarabunPSK"/>
+          <w:b/>
+          <w:bCs/>
+          <w:sz w:val="32"/>
+          <w:szCs w:val="32"/>
+        </w:rPr>
+        <w:t xml:space="preserve">RFID-RC522 </w:t>
+      </w:r>
+      <w:proofErr w:type="gramStart"/>
+      <w:r>
+        <w:rPr>
+          <w:rFonts w:ascii="TH SarabunPSK" w:hAnsi="TH SarabunPSK" w:cs="TH SarabunPSK"/>
+          <w:b/>
+          <w:bCs/>
+          <w:sz w:val="32"/>
+          <w:szCs w:val="32"/>
+        </w:rPr>
+        <w:t>Sensor</w:t>
+      </w:r>
+      <w:r>
+        <w:rPr>
+          <w:rFonts w:ascii="TH SarabunPSK" w:hAnsi="TH SarabunPSK" w:cs="TH SarabunPSK"/>
+          <w:b/>
+          <w:bCs/>
+          <w:sz w:val="32"/>
+          <w:szCs w:val="32"/>
+        </w:rPr>
+        <w:t xml:space="preserve"> :</w:t>
+      </w:r>
+      <w:proofErr w:type="gramEnd"/>
+      <w:r>
+        <w:rPr>
+          <w:rFonts w:ascii="TH SarabunPSK" w:hAnsi="TH SarabunPSK" w:cs="TH SarabunPSK"/>
+          <w:b/>
+          <w:bCs/>
+          <w:sz w:val="32"/>
+          <w:szCs w:val="32"/>
+        </w:rPr>
+        <w:t xml:space="preserve"> </w:t>
+      </w:r>
+      <w:r>
+        <w:rPr>
+          <w:rFonts w:ascii="TH SarabunPSK" w:hAnsi="TH SarabunPSK" w:cs="TH SarabunPSK"/>
+          <w:sz w:val="32"/>
+          <w:szCs w:val="32"/>
+          <w:cs/>
+        </w:rPr>
+        <w:t xml:space="preserve">โมดูล </w:t>
+      </w:r>
+      <w:r>
+        <w:rPr>
+          <w:rFonts w:ascii="TH SarabunPSK" w:hAnsi="TH SarabunPSK" w:cs="TH SarabunPSK"/>
+          <w:sz w:val="32"/>
+          <w:szCs w:val="32"/>
+        </w:rPr>
+        <w:t xml:space="preserve">RFID </w:t>
+      </w:r>
+      <w:r>
+        <w:rPr>
+          <w:rFonts w:ascii="TH SarabunPSK" w:hAnsi="TH SarabunPSK" w:cs="TH SarabunPSK"/>
+          <w:sz w:val="32"/>
+          <w:szCs w:val="32"/>
+          <w:cs/>
+        </w:rPr>
+        <w:t xml:space="preserve">ที่มีฟังก์ชันการทำงานสูง ใช้การสื่อสารแบบไม่สัมผัสที่ความถี่ </w:t>
+      </w:r>
+      <w:r>
+        <w:rPr>
+          <w:rFonts w:ascii="TH SarabunPSK" w:hAnsi="TH SarabunPSK" w:cs="TH SarabunPSK"/>
+          <w:sz w:val="32"/>
+          <w:szCs w:val="32"/>
+        </w:rPr>
+        <w:t xml:space="preserve">13.56 MHz </w:t>
+      </w:r>
+      <w:r>
+        <w:rPr>
+          <w:rFonts w:ascii="TH SarabunPSK" w:hAnsi="TH SarabunPSK" w:cs="TH SarabunPSK"/>
+          <w:sz w:val="32"/>
+          <w:szCs w:val="32"/>
+          <w:cs/>
+        </w:rPr>
+        <w:t xml:space="preserve">โดยออกแบบโดย </w:t>
+      </w:r>
+      <w:r>
+        <w:rPr>
+          <w:rFonts w:ascii="TH SarabunPSK" w:hAnsi="TH SarabunPSK" w:cs="TH SarabunPSK"/>
+          <w:sz w:val="32"/>
+          <w:szCs w:val="32"/>
+        </w:rPr>
+        <w:t>NXP</w:t>
+      </w:r>
+      <w:r>
+        <w:rPr>
+          <w:rFonts w:ascii="TH SarabunPSK" w:hAnsi="TH SarabunPSK" w:cs="TH SarabunPSK"/>
+          <w:sz w:val="32"/>
+          <w:szCs w:val="32"/>
+        </w:rPr>
+        <w:t xml:space="preserve"> </w:t>
+      </w:r>
+      <w:r>
+        <w:rPr>
+          <w:rFonts w:ascii="TH SarabunPSK" w:hAnsi="TH SarabunPSK" w:cs="TH SarabunPSK"/>
+          <w:sz w:val="32"/>
+          <w:szCs w:val="32"/>
+          <w:cs/>
+        </w:rPr>
+        <w:t>มีคุณสมบัติที่โดดเด่นในด้านการใช้พลังงานต่ำ ต้นทุนต่ำ และขนาดกะทัดรัด ทำให้เหมาะสำหรับการพัฒนามิเตอร์</w:t>
+      </w:r>
+      <w:r>
+        <w:rPr>
+          <w:rFonts w:ascii="TH SarabunPSK" w:hAnsi="TH SarabunPSK" w:cs="TH SarabunPSK"/>
+          <w:sz w:val="32"/>
+          <w:szCs w:val="32"/>
+        </w:rPr>
+        <w:t xml:space="preserve"> </w:t>
+      </w:r>
+      <w:r>
+        <w:rPr>
+          <w:rFonts w:ascii="TH SarabunPSK" w:hAnsi="TH SarabunPSK" w:cs="TH SarabunPSK"/>
+          <w:sz w:val="32"/>
+          <w:szCs w:val="32"/>
+          <w:cs/>
+        </w:rPr>
+        <w:t>อัจฉริยะและอุปกรณ์พกพา โมดูลนี้ใช้ระบบมอดู</w:t>
+      </w:r>
+      <w:proofErr w:type="spellStart"/>
+      <w:r>
+        <w:rPr>
+          <w:rFonts w:ascii="TH SarabunPSK" w:hAnsi="TH SarabunPSK" w:cs="TH SarabunPSK"/>
+          <w:sz w:val="32"/>
+          <w:szCs w:val="32"/>
+          <w:cs/>
+        </w:rPr>
+        <w:t>เลชั่น</w:t>
+      </w:r>
+      <w:proofErr w:type="spellEnd"/>
+      <w:r>
+        <w:rPr>
+          <w:rFonts w:ascii="TH SarabunPSK" w:hAnsi="TH SarabunPSK" w:cs="TH SarabunPSK"/>
+          <w:sz w:val="32"/>
+          <w:szCs w:val="32"/>
+          <w:cs/>
+        </w:rPr>
+        <w:t xml:space="preserve">ที่ทันสมัย รองรับโปรโตคอลการสื่อสารไม่สัมผัสที่หลากหลาย โดยสามารถจัดการกับสัญญาณ </w:t>
+      </w:r>
+      <w:r>
+        <w:rPr>
+          <w:rFonts w:ascii="TH SarabunPSK" w:hAnsi="TH SarabunPSK" w:cs="TH SarabunPSK"/>
+          <w:sz w:val="32"/>
+          <w:szCs w:val="32"/>
+        </w:rPr>
+        <w:t xml:space="preserve">ISO14443A </w:t>
+      </w:r>
+      <w:r>
+        <w:rPr>
+          <w:rFonts w:ascii="TH SarabunPSK" w:hAnsi="TH SarabunPSK" w:cs="TH SarabunPSK"/>
+          <w:sz w:val="32"/>
+          <w:szCs w:val="32"/>
+          <w:cs/>
+        </w:rPr>
+        <w:t xml:space="preserve">และรองรับการเข้ารหัส </w:t>
+      </w:r>
+      <w:r>
+        <w:rPr>
+          <w:rFonts w:ascii="TH SarabunPSK" w:hAnsi="TH SarabunPSK" w:cs="TH SarabunPSK"/>
+          <w:sz w:val="32"/>
+          <w:szCs w:val="32"/>
+        </w:rPr>
+        <w:t>CRYPTO1</w:t>
+      </w:r>
+    </w:p>
+    <w:p>
+      <w:pPr>
+        <w:rPr>
+          <w:rFonts w:ascii="TH SarabunPSK" w:hAnsi="TH SarabunPSK" w:cs="TH SarabunPSK"/>
+          <w:sz w:val="32"/>
+          <w:szCs w:val="32"/>
+        </w:rPr>
+      </w:pPr>
+      <w:r>
+        <w:rPr>
+          <w:noProof/>
+        </w:rPr>
+        <w:drawing>
+          <wp:anchor distT="0" distB="0" distL="114300" distR="114300" simplePos="0" relativeHeight="251731968" behindDoc="0" locked="0" layoutInCell="1" allowOverlap="1" wp14:anchorId="772F234C" wp14:editId="3A6928F9">
+            <wp:simplePos x="0" y="0"/>
+            <wp:positionH relativeFrom="column">
+              <wp:posOffset>1584182</wp:posOffset>
+            </wp:positionH>
+            <wp:positionV relativeFrom="paragraph">
+              <wp:posOffset>13335</wp:posOffset>
+            </wp:positionV>
+            <wp:extent cx="2756678" cy="1737360"/>
+            <wp:effectExtent l="0" t="0" r="5715" b="0"/>
+            <wp:wrapNone/>
+            <wp:docPr id="8" name="รูปภาพ 8" descr="RFID-RC522 Sensor | Arduino Project Hub"/>
+            <wp:cNvGraphicFramePr>
+              <a:graphicFrameLocks xmlns:a="http://schemas.openxmlformats.org/drawingml/2006/main" noChangeAspect="1"/>
+            </wp:cNvGraphicFramePr>
+            <a:graphic xmlns:a="http://schemas.openxmlformats.org/drawingml/2006/main">
+              <a:graphicData uri="http://schemas.openxmlformats.org/drawingml/2006/picture">
+                <pic:pic xmlns:pic="http://schemas.openxmlformats.org/drawingml/2006/picture">
+                  <pic:nvPicPr>
+                    <pic:cNvPr id="0" name="Picture 9" descr="RFID-RC522 Sensor | Arduino Project Hub"/>
+                    <pic:cNvPicPr>
+                      <a:picLocks noChangeAspect="1" noChangeArrowheads="1"/>
+                    </pic:cNvPicPr>
+                  </pic:nvPicPr>
+                  <pic:blipFill rotWithShape="1">
+                    <a:blip r:embed="rId15">
+                      <a:extLst>
+                        <a:ext uri="{28A0092B-C50C-407E-A947-70E740481C1C}">
+                          <a14:useLocalDpi xmlns:a14="http://schemas.microsoft.com/office/drawing/2010/main" val="0"/>
+                        </a:ext>
+                      </a:extLst>
+                    </a:blip>
+                    <a:srcRect r="27011" b="38671"/>
+                    <a:stretch/>
+                  </pic:blipFill>
+                  <pic:spPr bwMode="auto">
+                    <a:xfrm>
+                      <a:off x="0" y="0"/>
+                      <a:ext cx="2757980" cy="1738181"/>
+                    </a:xfrm>
+                    <a:prstGeom prst="rect">
+                      <a:avLst/>
+                    </a:prstGeom>
+                    <a:noFill/>
+                    <a:ln>
+                      <a:noFill/>
+                    </a:ln>
+                    <a:extLst>
+                      <a:ext uri="{53640926-AAD7-44D8-BBD7-CCE9431645EC}">
+                        <a14:shadowObscured xmlns:a14="http://schemas.microsoft.com/office/drawing/2010/main"/>
+                      </a:ext>
+                    </a:extLst>
+                  </pic:spPr>
+                </pic:pic>
+              </a:graphicData>
+            </a:graphic>
+            <wp14:sizeRelH relativeFrom="page">
+              <wp14:pctWidth>0</wp14:pctWidth>
+            </wp14:sizeRelH>
+            <wp14:sizeRelV relativeFrom="page">
+              <wp14:pctHeight>0</wp14:pctHeight>
+            </wp14:sizeRelV>
+          </wp:anchor>
+        </w:drawing>
+      </w:r>
+    </w:p>
+    <w:p>
+      <w:pPr>
+        <w:rPr>
+          <w:rFonts w:ascii="TH SarabunPSK" w:hAnsi="TH SarabunPSK" w:cs="TH SarabunPSK"/>
+          <w:sz w:val="32"/>
+          <w:szCs w:val="32"/>
+        </w:rPr>
+      </w:pPr>
+    </w:p>
+    <w:p>
+      <w:pPr>
+        <w:rPr>
+          <w:rFonts w:ascii="TH SarabunPSK" w:hAnsi="TH SarabunPSK" w:cs="TH SarabunPSK"/>
+          <w:sz w:val="32"/>
+          <w:szCs w:val="32"/>
+        </w:rPr>
+      </w:pPr>
+    </w:p>
+    <w:p>
+      <w:pPr>
+        <w:rPr>
+          <w:rFonts w:ascii="TH SarabunPSK" w:hAnsi="TH SarabunPSK" w:cs="TH SarabunPSK"/>
+          <w:sz w:val="32"/>
+          <w:szCs w:val="32"/>
+        </w:rPr>
+      </w:pPr>
+    </w:p>
+    <w:p>
+      <w:pPr>
+        <w:rPr>
+          <w:rFonts w:ascii="TH SarabunPSK" w:hAnsi="TH SarabunPSK" w:cs="TH SarabunPSK"/>
+          <w:sz w:val="32"/>
+          <w:szCs w:val="32"/>
+        </w:rPr>
+      </w:pPr>
+    </w:p>
+    <w:p>
+      <w:pPr>
+        <w:rPr>
+          <w:rFonts w:ascii="TH SarabunPSK" w:hAnsi="TH SarabunPSK" w:cs="TH SarabunPSK"/>
+          <w:b/>
+          <w:bCs/>
+          <w:sz w:val="32"/>
+          <w:szCs w:val="32"/>
+        </w:rPr>
+      </w:pPr>
+      <w:r>
+        <w:rPr>
+          <w:rFonts w:ascii="TH SarabunPSK" w:hAnsi="TH SarabunPSK" w:cs="TH SarabunPSK"/>
+          <w:b/>
+          <w:bCs/>
+          <w:sz w:val="32"/>
+          <w:szCs w:val="32"/>
+        </w:rPr>
+        <w:t>6</w:t>
+      </w:r>
+      <w:r>
+        <w:rPr>
+          <w:rFonts w:ascii="TH SarabunPSK" w:hAnsi="TH SarabunPSK" w:cs="TH SarabunPSK"/>
+          <w:b/>
+          <w:bCs/>
+          <w:sz w:val="32"/>
+          <w:szCs w:val="32"/>
+        </w:rPr>
+        <w:t>. Ultrasonic sensor</w:t>
+      </w:r>
+    </w:p>
+    <w:p>
+      <w:pPr>
+        <w:rPr>
+          <w:rFonts w:ascii="TH SarabunPSK" w:hAnsi="TH SarabunPSK" w:cs="TH SarabunPSK"/>
+          <w:sz w:val="32"/>
+          <w:szCs w:val="32"/>
+        </w:rPr>
+      </w:pPr>
+      <w:r>
+        <w:rPr>
+          <w:rFonts w:ascii="TH SarabunPSK" w:hAnsi="TH SarabunPSK" w:cs="TH SarabunPSK"/>
+          <w:sz w:val="32"/>
+          <w:szCs w:val="32"/>
+          <w:cs/>
+        </w:rPr>
+        <w:t xml:space="preserve">เซ็นเซอร์ที่ต้องอาศัยหลักการของการสะท้อนคลื่นความถี่ </w:t>
+      </w:r>
+      <w:r>
+        <w:rPr>
+          <w:rFonts w:ascii="TH SarabunPSK" w:hAnsi="TH SarabunPSK" w:cs="TH SarabunPSK"/>
+          <w:sz w:val="32"/>
+          <w:szCs w:val="32"/>
+        </w:rPr>
+        <w:t xml:space="preserve">Ultrasonic </w:t>
+      </w:r>
+      <w:r>
+        <w:rPr>
+          <w:rFonts w:ascii="TH SarabunPSK" w:hAnsi="TH SarabunPSK" w:cs="TH SarabunPSK"/>
+          <w:sz w:val="32"/>
+          <w:szCs w:val="32"/>
+          <w:cs/>
+        </w:rPr>
+        <w:t>ในการตรวจจับวัตถุต่าง ๆ</w:t>
+      </w:r>
+      <w:r>
+        <w:rPr>
+          <w:rFonts w:ascii="TH SarabunPSK" w:hAnsi="TH SarabunPSK" w:cs="TH SarabunPSK"/>
+          <w:sz w:val="32"/>
+          <w:szCs w:val="32"/>
+        </w:rPr>
+        <w:t xml:space="preserve"> </w:t>
+      </w:r>
+      <w:r>
+        <w:rPr>
+          <w:rFonts w:ascii="TH SarabunPSK" w:hAnsi="TH SarabunPSK" w:cs="TH SarabunPSK"/>
+          <w:sz w:val="32"/>
+          <w:szCs w:val="32"/>
+        </w:rPr>
+        <w:t xml:space="preserve">Ultrasonic sensor </w:t>
+      </w:r>
+      <w:r>
+        <w:rPr>
+          <w:rFonts w:ascii="TH SarabunPSK" w:hAnsi="TH SarabunPSK" w:cs="TH SarabunPSK"/>
+          <w:sz w:val="32"/>
+          <w:szCs w:val="32"/>
+          <w:cs/>
+        </w:rPr>
+        <w:t>นั้นจำเป็นต้องอาศัยตัวกลางในการเดินทาง เช่น อากาศ แก๊ส หรือของเหลว จึงทำให้</w:t>
+      </w:r>
+      <w:r>
+        <w:rPr>
+          <w:rFonts w:ascii="TH SarabunPSK" w:hAnsi="TH SarabunPSK" w:cs="TH SarabunPSK"/>
+          <w:sz w:val="32"/>
+          <w:szCs w:val="32"/>
+        </w:rPr>
+        <w:t xml:space="preserve"> </w:t>
+      </w:r>
+      <w:r>
+        <w:rPr>
+          <w:rFonts w:ascii="TH SarabunPSK" w:hAnsi="TH SarabunPSK" w:cs="TH SarabunPSK"/>
+          <w:sz w:val="32"/>
+          <w:szCs w:val="32"/>
+        </w:rPr>
+        <w:t xml:space="preserve">Ultrasonic sensor </w:t>
+      </w:r>
+      <w:r>
+        <w:rPr>
+          <w:rFonts w:ascii="TH SarabunPSK" w:hAnsi="TH SarabunPSK" w:cs="TH SarabunPSK"/>
+          <w:sz w:val="32"/>
+          <w:szCs w:val="32"/>
+          <w:cs/>
+        </w:rPr>
+        <w:t>สามารถใช้งานตรวจจับวัตถุได้หลากหลายชนิด ซึ่งวัตถุที่มีสถานะของเหลวโดยที่เป็นสารเคมีหรือมี</w:t>
+      </w:r>
+      <w:r>
+        <w:rPr>
+          <w:rFonts w:ascii="TH SarabunPSK" w:hAnsi="TH SarabunPSK" w:cs="TH SarabunPSK"/>
+          <w:sz w:val="32"/>
+          <w:szCs w:val="32"/>
+          <w:cs/>
+        </w:rPr>
+        <w:lastRenderedPageBreak/>
+        <w:t xml:space="preserve">ความหนืดก็สามารถใช้ </w:t>
+      </w:r>
+      <w:r>
+        <w:rPr>
+          <w:rFonts w:ascii="TH SarabunPSK" w:hAnsi="TH SarabunPSK" w:cs="TH SarabunPSK"/>
+          <w:sz w:val="32"/>
+          <w:szCs w:val="32"/>
+        </w:rPr>
+        <w:t xml:space="preserve">Ultrasonic sensor </w:t>
+      </w:r>
+      <w:r>
+        <w:rPr>
+          <w:rFonts w:ascii="TH SarabunPSK" w:hAnsi="TH SarabunPSK" w:cs="TH SarabunPSK"/>
+          <w:sz w:val="32"/>
+          <w:szCs w:val="32"/>
+          <w:cs/>
+        </w:rPr>
+        <w:t xml:space="preserve">ในการตรวจจับได้ และ </w:t>
+      </w:r>
+      <w:r>
+        <w:rPr>
+          <w:rFonts w:ascii="TH SarabunPSK" w:hAnsi="TH SarabunPSK" w:cs="TH SarabunPSK"/>
+          <w:sz w:val="32"/>
+          <w:szCs w:val="32"/>
+        </w:rPr>
+        <w:t xml:space="preserve">Ultrasonic sensor </w:t>
+      </w:r>
+      <w:r>
+        <w:rPr>
+          <w:rFonts w:ascii="TH SarabunPSK" w:hAnsi="TH SarabunPSK" w:cs="TH SarabunPSK"/>
+          <w:sz w:val="32"/>
+          <w:szCs w:val="32"/>
+          <w:cs/>
+        </w:rPr>
+        <w:t xml:space="preserve">มีความถี่ไปตั้งแต่ </w:t>
+      </w:r>
+      <w:r>
+        <w:rPr>
+          <w:rFonts w:ascii="TH SarabunPSK" w:hAnsi="TH SarabunPSK" w:cs="TH SarabunPSK"/>
+          <w:sz w:val="32"/>
+          <w:szCs w:val="32"/>
+        </w:rPr>
+        <w:t xml:space="preserve">20000Hz </w:t>
+      </w:r>
+      <w:r>
+        <w:rPr>
+          <w:rFonts w:ascii="TH SarabunPSK" w:hAnsi="TH SarabunPSK" w:cs="TH SarabunPSK"/>
+          <w:sz w:val="32"/>
+          <w:szCs w:val="32"/>
+          <w:cs/>
+        </w:rPr>
+        <w:t>ขึ้นไปซึ่งเป็นความถี่ที่สูงเกินกว่ามนุษย์จะสามารถรับรู้ได้</w:t>
+      </w:r>
+    </w:p>
+    <w:p>
+      <w:pPr>
+        <w:rPr>
+          <w:rFonts w:ascii="TH SarabunPSK" w:hAnsi="TH SarabunPSK" w:cs="TH SarabunPSK"/>
+          <w:sz w:val="32"/>
+          <w:szCs w:val="32"/>
+        </w:rPr>
+      </w:pPr>
+      <w:r>
+        <w:rPr>
+          <w:rFonts w:ascii="TH SarabunPSK" w:hAnsi="TH SarabunPSK" w:cs="TH SarabunPSK"/>
+          <w:sz w:val="32"/>
+          <w:szCs w:val="32"/>
+        </w:rPr>
+        <w:drawing>
+          <wp:anchor distT="0" distB="0" distL="114300" distR="114300" simplePos="0" relativeHeight="251734016" behindDoc="1" locked="0" layoutInCell="1" allowOverlap="1" wp14:anchorId="534A712E" wp14:editId="5427CC02">
+            <wp:simplePos x="0" y="0"/>
+            <wp:positionH relativeFrom="column">
+              <wp:posOffset>1790700</wp:posOffset>
+            </wp:positionH>
+            <wp:positionV relativeFrom="paragraph">
+              <wp:posOffset>9525</wp:posOffset>
+            </wp:positionV>
+            <wp:extent cx="2280285" cy="1629753"/>
+            <wp:effectExtent l="0" t="0" r="5715" b="8890"/>
+            <wp:wrapNone/>
+            <wp:docPr id="9" name="รูปภาพ 9"/>
+            <wp:cNvGraphicFramePr>
+              <a:graphicFrameLocks xmlns:a="http://schemas.openxmlformats.org/drawingml/2006/main" noChangeAspect="1"/>
+            </wp:cNvGraphicFramePr>
+            <a:graphic xmlns:a="http://schemas.openxmlformats.org/drawingml/2006/main">
+              <a:graphicData uri="http://schemas.openxmlformats.org/drawingml/2006/picture">
+                <pic:pic xmlns:pic="http://schemas.openxmlformats.org/drawingml/2006/picture">
+                  <pic:nvPicPr>
+                    <pic:cNvPr id="1" name=""/>
+                    <pic:cNvPicPr/>
+                  </pic:nvPicPr>
+                  <pic:blipFill>
+                    <a:blip r:embed="rId16"/>
+                    <a:stretch>
+                      <a:fillRect/>
+                    </a:stretch>
+                  </pic:blipFill>
+                  <pic:spPr>
+                    <a:xfrm>
+                      <a:off x="0" y="0"/>
+                      <a:ext cx="2280285" cy="1629753"/>
+                    </a:xfrm>
+                    <a:prstGeom prst="rect">
+                      <a:avLst/>
+                    </a:prstGeom>
+                  </pic:spPr>
+                </pic:pic>
+              </a:graphicData>
+            </a:graphic>
+            <wp14:sizeRelH relativeFrom="margin">
+              <wp14:pctWidth>0</wp14:pctWidth>
+            </wp14:sizeRelH>
+            <wp14:sizeRelV relativeFrom="margin">
+              <wp14:pctHeight>0</wp14:pctHeight>
+            </wp14:sizeRelV>
+          </wp:anchor>
+        </w:drawing>
+      </w:r>
+    </w:p>
+    <w:p>
+      <w:pPr>
+        <w:rPr>
+          <w:rFonts w:ascii="TH SarabunPSK" w:hAnsi="TH SarabunPSK" w:cs="TH SarabunPSK"/>
+          <w:sz w:val="32"/>
+          <w:szCs w:val="32"/>
+        </w:rPr>
+      </w:pPr>
+    </w:p>
+    <w:p>
+      <w:pPr>
+        <w:rPr>
+          <w:rFonts w:ascii="TH SarabunPSK" w:hAnsi="TH SarabunPSK" w:cs="TH SarabunPSK"/>
+          <w:sz w:val="32"/>
+          <w:szCs w:val="32"/>
+        </w:rPr>
+      </w:pPr>
+    </w:p>
+    <w:p>
+      <w:pPr>
+        <w:rPr>
+          <w:rFonts w:ascii="TH SarabunPSK" w:hAnsi="TH SarabunPSK" w:cs="TH SarabunPSK"/>
+          <w:sz w:val="32"/>
+          <w:szCs w:val="32"/>
+        </w:rPr>
+      </w:pPr>
+    </w:p>
+    <w:p>
+      <w:pPr>
+        <w:rPr>
+          <w:rFonts w:ascii="TH SarabunPSK" w:hAnsi="TH SarabunPSK" w:cs="TH SarabunPSK"/>
+          <w:b/>
+          <w:bCs/>
+          <w:sz w:val="32"/>
+          <w:szCs w:val="32"/>
+        </w:rPr>
+      </w:pPr>
+    </w:p>
+    <w:p>
+      <w:pPr>
+        <w:rPr>
+          <w:rFonts w:ascii="TH SarabunPSK" w:hAnsi="TH SarabunPSK" w:cs="TH SarabunPSK"/>
+          <w:sz w:val="32"/>
+          <w:szCs w:val="32"/>
+        </w:rPr>
+      </w:pPr>
+      <w:r>
+        <w:rPr>
+          <w:rFonts w:ascii="TH SarabunPSK" w:hAnsi="TH SarabunPSK" w:cs="TH SarabunPSK" w:hint="cs"/>
+          <w:b/>
+          <w:bCs/>
+          <w:sz w:val="32"/>
+          <w:szCs w:val="32"/>
+          <w:cs/>
+        </w:rPr>
+        <w:t>7.</w:t>
+      </w:r>
+      <w:r>
+        <w:rPr>
+          <w:b/>
+          <w:bCs/>
+        </w:rPr>
+        <w:t xml:space="preserve"> </w:t>
+      </w:r>
+      <w:r>
+        <w:rPr>
+          <w:rFonts w:ascii="TH SarabunPSK" w:hAnsi="TH SarabunPSK" w:cs="TH SarabunPSK"/>
+          <w:b/>
+          <w:bCs/>
+          <w:sz w:val="32"/>
+          <w:szCs w:val="32"/>
+        </w:rPr>
+        <w:t>LM</w:t>
+      </w:r>
+      <w:r>
+        <w:rPr>
+          <w:rFonts w:ascii="TH SarabunPSK" w:hAnsi="TH SarabunPSK" w:cs="TH SarabunPSK"/>
+          <w:b/>
+          <w:bCs/>
+          <w:sz w:val="32"/>
+          <w:szCs w:val="32"/>
+          <w:cs/>
+        </w:rPr>
+        <w:t>386 200</w:t>
+      </w:r>
+      <w:r>
+        <w:rPr>
+          <w:rFonts w:ascii="TH SarabunPSK" w:hAnsi="TH SarabunPSK" w:cs="TH SarabunPSK"/>
+          <w:b/>
+          <w:bCs/>
+          <w:sz w:val="32"/>
+          <w:szCs w:val="32"/>
+        </w:rPr>
+        <w:t xml:space="preserve">× Gain Audio </w:t>
+      </w:r>
+      <w:proofErr w:type="gramStart"/>
+      <w:r>
+        <w:rPr>
+          <w:rFonts w:ascii="TH SarabunPSK" w:hAnsi="TH SarabunPSK" w:cs="TH SarabunPSK"/>
+          <w:b/>
+          <w:bCs/>
+          <w:sz w:val="32"/>
+          <w:szCs w:val="32"/>
+        </w:rPr>
+        <w:t>Amplifier</w:t>
+      </w:r>
+      <w:r>
+        <w:rPr>
+          <w:rFonts w:ascii="TH SarabunPSK" w:hAnsi="TH SarabunPSK" w:cs="TH SarabunPSK"/>
+          <w:sz w:val="32"/>
+          <w:szCs w:val="32"/>
+        </w:rPr>
+        <w:t xml:space="preserve"> </w:t>
+      </w:r>
+      <w:r>
+        <w:rPr>
+          <w:rFonts w:ascii="TH SarabunPSK" w:hAnsi="TH SarabunPSK" w:cs="TH SarabunPSK"/>
+          <w:b/>
+          <w:bCs/>
+          <w:sz w:val="32"/>
+          <w:szCs w:val="32"/>
+        </w:rPr>
+        <w:t>:</w:t>
+      </w:r>
+      <w:proofErr w:type="gramEnd"/>
+      <w:r>
+        <w:rPr>
+          <w:rFonts w:ascii="TH SarabunPSK" w:hAnsi="TH SarabunPSK" w:cs="TH SarabunPSK"/>
+          <w:sz w:val="32"/>
+          <w:szCs w:val="32"/>
+        </w:rPr>
+        <w:t xml:space="preserve"> </w:t>
+      </w:r>
+      <w:r>
+        <w:rPr>
+          <w:rFonts w:ascii="TH SarabunPSK" w:hAnsi="TH SarabunPSK" w:cs="TH SarabunPSK"/>
+          <w:sz w:val="32"/>
+          <w:szCs w:val="32"/>
+          <w:cs/>
+        </w:rPr>
+        <w:t xml:space="preserve">เป็นวงจรขยายเสียงราคาประหยัดที่ใช้งานง่าย เหมาะสำหรับโครงงานอิเล็กทรอนิกส์และงานทดลองทั่วไป โดยใช้ชิป </w:t>
+      </w:r>
+      <w:r>
+        <w:rPr>
+          <w:rFonts w:ascii="TH SarabunPSK" w:hAnsi="TH SarabunPSK" w:cs="TH SarabunPSK"/>
+          <w:sz w:val="32"/>
+          <w:szCs w:val="32"/>
+        </w:rPr>
+        <w:t>LM</w:t>
+      </w:r>
+      <w:r>
+        <w:rPr>
+          <w:rFonts w:ascii="TH SarabunPSK" w:hAnsi="TH SarabunPSK" w:cs="TH SarabunPSK"/>
+          <w:sz w:val="32"/>
+          <w:szCs w:val="32"/>
+          <w:cs/>
+        </w:rPr>
+        <w:t xml:space="preserve">386 ซึ่งสามารถขยายสัญญาณเสียงได้สูงสุดประมาณ 200 เท่า ภายในโมดูลมีตัวต้านทานปรับค่าได้ขนาด 10 </w:t>
+      </w:r>
+      <w:proofErr w:type="spellStart"/>
+      <w:r>
+        <w:rPr>
+          <w:rFonts w:ascii="TH SarabunPSK" w:hAnsi="TH SarabunPSK" w:cs="TH SarabunPSK"/>
+          <w:sz w:val="32"/>
+          <w:szCs w:val="32"/>
+        </w:rPr>
+        <w:t>k</w:t>
+      </w:r>
+      <w:r>
+        <w:rPr>
+          <w:rFonts w:ascii="Calibri" w:hAnsi="Calibri" w:cs="Calibri"/>
+          <w:sz w:val="32"/>
+          <w:szCs w:val="32"/>
+        </w:rPr>
+        <w:t>Ω</w:t>
+      </w:r>
+      <w:proofErr w:type="spellEnd"/>
+      <w:r>
+        <w:rPr>
+          <w:rFonts w:ascii="TH SarabunPSK" w:hAnsi="TH SarabunPSK" w:cs="TH SarabunPSK"/>
+          <w:sz w:val="32"/>
+          <w:szCs w:val="32"/>
+        </w:rPr>
+        <w:t xml:space="preserve"> </w:t>
+      </w:r>
+      <w:r>
+        <w:rPr>
+          <w:rFonts w:ascii="TH SarabunPSK" w:hAnsi="TH SarabunPSK" w:cs="TH SarabunPSK"/>
+          <w:sz w:val="32"/>
+          <w:szCs w:val="32"/>
+          <w:cs/>
+        </w:rPr>
+        <w:t xml:space="preserve">สำหรับควบคุมระดับเสียง มีจุดเชื่อมต่อลำโพงในตัว และไฟแสดงสถานะเมื่อจ่ายไฟเข้า รองรับแรงดันไฟฟ้าอินพุตในช่วง 5 – 12 </w:t>
+      </w:r>
+      <w:r>
+        <w:rPr>
+          <w:rFonts w:ascii="TH SarabunPSK" w:hAnsi="TH SarabunPSK" w:cs="TH SarabunPSK"/>
+          <w:sz w:val="32"/>
+          <w:szCs w:val="32"/>
+        </w:rPr>
+        <w:t xml:space="preserve">V </w:t>
+      </w:r>
+      <w:r>
+        <w:rPr>
+          <w:rFonts w:ascii="TH SarabunPSK" w:hAnsi="TH SarabunPSK" w:cs="TH SarabunPSK"/>
+          <w:sz w:val="32"/>
+          <w:szCs w:val="32"/>
+          <w:cs/>
+        </w:rPr>
+        <w:t xml:space="preserve">และมีขนาดเล็กเพียง 41 </w:t>
+      </w:r>
+      <w:r>
+        <w:rPr>
+          <w:rFonts w:ascii="TH SarabunPSK" w:hAnsi="TH SarabunPSK" w:cs="TH SarabunPSK"/>
+          <w:sz w:val="32"/>
+          <w:szCs w:val="32"/>
+        </w:rPr>
+        <w:t xml:space="preserve">× </w:t>
+      </w:r>
+      <w:r>
+        <w:rPr>
+          <w:rFonts w:ascii="TH SarabunPSK" w:hAnsi="TH SarabunPSK" w:cs="TH SarabunPSK"/>
+          <w:sz w:val="32"/>
+          <w:szCs w:val="32"/>
+          <w:cs/>
+        </w:rPr>
+        <w:t>13 มม. ทำให้ติดตั้งได้สะดวก จุดเด่นของโมดูลนี้คือความเรียบง่ายและความยืดหยุ่นในการใช้งาน อย่างไรก็ตาม เนื่องจากมีอัตราขยายสูง จึงควรระวังเรื่องสัญญาณรบกวนและคุณภาพเสียง โดยเฉพาะเมื่อใช้กับสัญญาณอินพุตที่มีความแรงสูงหรือสายสัญญาณที่ไม่ได้ป้องกันอย่างเหมาะสม</w:t>
+      </w:r>
+    </w:p>
+    <w:p>
+      <w:pPr>
+        <w:rPr>
+          <w:rFonts w:ascii="TH SarabunPSK" w:hAnsi="TH SarabunPSK" w:cs="TH SarabunPSK"/>
+          <w:sz w:val="32"/>
+          <w:szCs w:val="32"/>
+        </w:rPr>
+      </w:pPr>
+      <w:r>
+        <w:rPr>
+          <w:noProof/>
+        </w:rPr>
+        <w:drawing>
+          <wp:anchor distT="0" distB="0" distL="114300" distR="114300" simplePos="0" relativeHeight="251735040" behindDoc="0" locked="0" layoutInCell="1" allowOverlap="1" wp14:anchorId="07D90454" wp14:editId="3F36BBE7">
+            <wp:simplePos x="0" y="0"/>
+            <wp:positionH relativeFrom="column">
+              <wp:posOffset>1310640</wp:posOffset>
+            </wp:positionH>
+            <wp:positionV relativeFrom="paragraph">
+              <wp:posOffset>138430</wp:posOffset>
+            </wp:positionV>
+            <wp:extent cx="2957713" cy="2156460"/>
+            <wp:effectExtent l="0" t="0" r="0" b="0"/>
+            <wp:wrapNone/>
+            <wp:docPr id="10" name="รูปภาพ 10" descr="LM386 Audio Amplifier Module"/>
+            <wp:cNvGraphicFramePr>
+              <a:graphicFrameLocks xmlns:a="http://schemas.openxmlformats.org/drawingml/2006/main" noChangeAspect="1"/>
+            </wp:cNvGraphicFramePr>
+            <a:graphic xmlns:a="http://schemas.openxmlformats.org/drawingml/2006/main">
+              <a:graphicData uri="http://schemas.openxmlformats.org/drawingml/2006/picture">
+                <pic:pic xmlns:pic="http://schemas.openxmlformats.org/drawingml/2006/picture">
+                  <pic:nvPicPr>
+                    <pic:cNvPr id="0" name="Picture 11" descr="LM386 Audio Amplifier Module"/>
+                    <pic:cNvPicPr>
+                      <a:picLocks noChangeAspect="1" noChangeArrowheads="1"/>
+                    </pic:cNvPicPr>
+                  </pic:nvPicPr>
+                  <pic:blipFill rotWithShape="1">
+                    <a:blip r:embed="rId17">
+                      <a:extLst>
+                        <a:ext uri="{28A0092B-C50C-407E-A947-70E740481C1C}">
+                          <a14:useLocalDpi xmlns:a14="http://schemas.microsoft.com/office/drawing/2010/main" val="0"/>
+                        </a:ext>
+                      </a:extLst>
+                    </a:blip>
+                    <a:srcRect l="11699" t="21139" r="8797" b="20895"/>
+                    <a:stretch/>
+                  </pic:blipFill>
+                  <pic:spPr bwMode="auto">
+                    <a:xfrm>
+                      <a:off x="0" y="0"/>
+                      <a:ext cx="2957713" cy="2156460"/>
+                    </a:xfrm>
+                    <a:prstGeom prst="rect">
+                      <a:avLst/>
+                    </a:prstGeom>
+                    <a:noFill/>
+                    <a:ln>
+                      <a:noFill/>
+                    </a:ln>
+                    <a:extLst>
+                      <a:ext uri="{53640926-AAD7-44D8-BBD7-CCE9431645EC}">
+                        <a14:shadowObscured xmlns:a14="http://schemas.microsoft.com/office/drawing/2010/main"/>
+                      </a:ext>
+                    </a:extLst>
+                  </pic:spPr>
+                </pic:pic>
+              </a:graphicData>
+            </a:graphic>
+            <wp14:sizeRelH relativeFrom="page">
+              <wp14:pctWidth>0</wp14:pctWidth>
+            </wp14:sizeRelH>
+            <wp14:sizeRelV relativeFrom="page">
+              <wp14:pctHeight>0</wp14:pctHeight>
+            </wp14:sizeRelV>
+          </wp:anchor>
+        </w:drawing>
+      </w:r>
+    </w:p>
+    <w:p>
+      <w:pPr>
+        <w:rPr>
+          <w:rFonts w:ascii="TH SarabunPSK" w:hAnsi="TH SarabunPSK" w:cs="TH SarabunPSK" w:hint="cs"/>
+          <w:sz w:val="32"/>
+          <w:szCs w:val="32"/>
+          <w:cs/>
+        </w:rPr>
+      </w:pPr>
+    </w:p>
+    <w:p>
+      <w:pPr>
+        <w:rPr>
+          <w:rFonts w:ascii="TH SarabunPSK" w:hAnsi="TH SarabunPSK" w:cs="TH SarabunPSK"/>
+          <w:sz w:val="32"/>
+          <w:szCs w:val="32"/>
+        </w:rPr>
+      </w:pPr>
+    </w:p>
+    <w:p>
+      <w:pPr>
+        <w:rPr>
+          <w:rFonts w:ascii="TH SarabunPSK" w:hAnsi="TH SarabunPSK" w:cs="TH SarabunPSK"/>
+          <w:sz w:val="32"/>
+          <w:szCs w:val="32"/>
+        </w:rPr>
+      </w:pPr>
+    </w:p>
+    <w:p>
+      <w:pPr>
+        <w:rPr>
+          <w:rFonts w:ascii="TH SarabunPSK" w:hAnsi="TH SarabunPSK" w:cs="TH SarabunPSK"/>
+          <w:sz w:val="32"/>
+          <w:szCs w:val="32"/>
+        </w:rPr>
+      </w:pPr>
+    </w:p>
+    <w:p>
+      <w:pPr>
+        <w:rPr>
+          <w:rFonts w:ascii="TH SarabunPSK" w:hAnsi="TH SarabunPSK" w:cs="TH SarabunPSK"/>
+          <w:sz w:val="32"/>
+          <w:szCs w:val="32"/>
+        </w:rPr>
+      </w:pPr>
+    </w:p>
+    <w:p>
+      <w:pPr>
+        <w:rPr>
+          <w:rFonts w:ascii="TH SarabunPSK" w:hAnsi="TH SarabunPSK" w:cs="TH SarabunPSK"/>
+          <w:sz w:val="32"/>
+          <w:szCs w:val="32"/>
+        </w:rPr>
+      </w:pPr>
+    </w:p>
+    <w:p>
+      <w:pPr>
+        <w:rPr>
+          <w:rFonts w:ascii="TH SarabunPSK" w:hAnsi="TH SarabunPSK" w:cs="TH SarabunPSK"/>
+          <w:sz w:val="32"/>
+          <w:szCs w:val="32"/>
+        </w:rPr>
+      </w:pPr>
+      <w:r>
+        <w:rPr>
+          <w:rFonts w:ascii="TH SarabunPSK" w:hAnsi="TH SarabunPSK" w:cs="TH SarabunPSK" w:hint="cs"/>
+          <w:b/>
+          <w:bCs/>
+          <w:sz w:val="32"/>
+          <w:szCs w:val="32"/>
+          <w:cs/>
+        </w:rPr>
+        <w:t>8.</w:t>
+      </w:r>
+      <w:r>
+        <w:rPr>
+          <w:rFonts w:ascii="TH SarabunPSK" w:hAnsi="TH SarabunPSK" w:cs="TH SarabunPSK" w:hint="cs"/>
+          <w:b/>
+          <w:bCs/>
+          <w:sz w:val="32"/>
+          <w:szCs w:val="32"/>
+          <w:cs/>
+        </w:rPr>
+        <w:t xml:space="preserve"> </w:t>
+      </w:r>
+      <w:r>
+        <w:rPr>
+          <w:rFonts w:ascii="TH SarabunPSK" w:hAnsi="TH SarabunPSK" w:cs="TH SarabunPSK"/>
+          <w:b/>
+          <w:bCs/>
+          <w:sz w:val="32"/>
+          <w:szCs w:val="32"/>
+          <w:cs/>
+        </w:rPr>
+        <w:t xml:space="preserve">โมดูลสแกนลายนิ้วมือ </w:t>
+      </w:r>
+      <w:r>
+        <w:rPr>
+          <w:rFonts w:ascii="TH SarabunPSK" w:hAnsi="TH SarabunPSK" w:cs="TH SarabunPSK"/>
+          <w:b/>
+          <w:bCs/>
+          <w:sz w:val="32"/>
+          <w:szCs w:val="32"/>
+        </w:rPr>
+        <w:t>AS608</w:t>
+      </w:r>
+      <w:r>
+        <w:rPr>
+          <w:rFonts w:ascii="TH SarabunPSK" w:hAnsi="TH SarabunPSK" w:cs="TH SarabunPSK"/>
+          <w:b/>
+          <w:bCs/>
+          <w:sz w:val="32"/>
+          <w:szCs w:val="32"/>
+        </w:rPr>
+        <w:t xml:space="preserve"> :</w:t>
+      </w:r>
+      <w:r>
+        <w:rPr>
+          <w:rFonts w:ascii="TH SarabunPSK" w:hAnsi="TH SarabunPSK" w:cs="TH SarabunPSK"/>
+          <w:sz w:val="32"/>
+          <w:szCs w:val="32"/>
+        </w:rPr>
+        <w:t xml:space="preserve"> </w:t>
+      </w:r>
+      <w:r>
+        <w:rPr>
+          <w:rFonts w:ascii="TH SarabunPSK" w:hAnsi="TH SarabunPSK" w:cs="TH SarabunPSK"/>
+          <w:sz w:val="32"/>
+          <w:szCs w:val="32"/>
+          <w:cs/>
+        </w:rPr>
+        <w:t xml:space="preserve">เป็นเซนเซอร์แบบออปติคัลที่ใช้เทคโนโลยีแสงในการจับภาพลายนิ้วมือและประมวลผลภายในตัว โดยสามารถจดจำและเปรียบเทียบลายนิ้วมือได้โดยไม่ต้องพึ่งไมโครคอนโทรลเลอร์ในการประมวลผลมากนัก รองรับแรงดันไฟฟ้า </w:t>
+      </w:r>
+      <w:r>
+        <w:rPr>
+          <w:rFonts w:ascii="TH SarabunPSK" w:hAnsi="TH SarabunPSK" w:cs="TH SarabunPSK"/>
+          <w:sz w:val="32"/>
+          <w:szCs w:val="32"/>
+        </w:rPr>
+        <w:t xml:space="preserve">3.6 – 6.0V </w:t>
+      </w:r>
+      <w:r>
+        <w:rPr>
+          <w:rFonts w:ascii="TH SarabunPSK" w:hAnsi="TH SarabunPSK" w:cs="TH SarabunPSK"/>
+          <w:sz w:val="32"/>
+          <w:szCs w:val="32"/>
+          <w:cs/>
+        </w:rPr>
+        <w:t xml:space="preserve">ใช้กระแสต่ำ และสื่อสารผ่าน </w:t>
+      </w:r>
+      <w:r>
+        <w:rPr>
+          <w:rFonts w:ascii="TH SarabunPSK" w:hAnsi="TH SarabunPSK" w:cs="TH SarabunPSK"/>
+          <w:sz w:val="32"/>
+          <w:szCs w:val="32"/>
+        </w:rPr>
+        <w:t xml:space="preserve">UART (TTL) </w:t>
+      </w:r>
+      <w:r>
+        <w:rPr>
+          <w:rFonts w:ascii="TH SarabunPSK" w:hAnsi="TH SarabunPSK" w:cs="TH SarabunPSK"/>
+          <w:sz w:val="32"/>
+          <w:szCs w:val="32"/>
+          <w:cs/>
+        </w:rPr>
+        <w:t xml:space="preserve">ทำให้ใช้งานร่วมกับบอร์ดไมโครคอนโทรลเลอร์อย่าง </w:t>
+      </w:r>
+      <w:r>
+        <w:rPr>
+          <w:rFonts w:ascii="TH SarabunPSK" w:hAnsi="TH SarabunPSK" w:cs="TH SarabunPSK"/>
+          <w:sz w:val="32"/>
+          <w:szCs w:val="32"/>
+        </w:rPr>
+        <w:t xml:space="preserve">Arduino </w:t>
+      </w:r>
+      <w:r>
+        <w:rPr>
+          <w:rFonts w:ascii="TH SarabunPSK" w:hAnsi="TH SarabunPSK" w:cs="TH SarabunPSK"/>
+          <w:sz w:val="32"/>
+          <w:szCs w:val="32"/>
+          <w:cs/>
+        </w:rPr>
+        <w:t xml:space="preserve">หรือ </w:t>
+      </w:r>
+      <w:r>
+        <w:rPr>
+          <w:rFonts w:ascii="TH SarabunPSK" w:hAnsi="TH SarabunPSK" w:cs="TH SarabunPSK"/>
+          <w:sz w:val="32"/>
+          <w:szCs w:val="32"/>
+        </w:rPr>
+        <w:t xml:space="preserve">ESP32 </w:t>
+      </w:r>
+      <w:r>
+        <w:rPr>
+          <w:rFonts w:ascii="TH SarabunPSK" w:hAnsi="TH SarabunPSK" w:cs="TH SarabunPSK"/>
+          <w:sz w:val="32"/>
+          <w:szCs w:val="32"/>
+          <w:cs/>
+        </w:rPr>
+        <w:t>ได้อย่างสะดวก โมดูลนี้สามารถบันทึก</w:t>
+      </w:r>
+      <w:r>
+        <w:rPr>
+          <w:rFonts w:ascii="TH SarabunPSK" w:hAnsi="TH SarabunPSK" w:cs="TH SarabunPSK"/>
+          <w:sz w:val="32"/>
+          <w:szCs w:val="32"/>
+          <w:cs/>
+        </w:rPr>
+        <w:lastRenderedPageBreak/>
+        <w:t xml:space="preserve">ลายนิ้วมือได้ประมาณ </w:t>
+      </w:r>
+      <w:r>
+        <w:rPr>
+          <w:rFonts w:ascii="TH SarabunPSK" w:hAnsi="TH SarabunPSK" w:cs="TH SarabunPSK"/>
+          <w:sz w:val="32"/>
+          <w:szCs w:val="32"/>
+        </w:rPr>
+        <w:t xml:space="preserve">162 </w:t>
+      </w:r>
+      <w:r>
+        <w:rPr>
+          <w:rFonts w:ascii="TH SarabunPSK" w:hAnsi="TH SarabunPSK" w:cs="TH SarabunPSK"/>
+          <w:sz w:val="32"/>
+          <w:szCs w:val="32"/>
+          <w:cs/>
+        </w:rPr>
+        <w:t xml:space="preserve">แม่แบบ มีความละเอียดประมาณ </w:t>
+      </w:r>
+      <w:r>
+        <w:rPr>
+          <w:rFonts w:ascii="TH SarabunPSK" w:hAnsi="TH SarabunPSK" w:cs="TH SarabunPSK"/>
+          <w:sz w:val="32"/>
+          <w:szCs w:val="32"/>
+        </w:rPr>
+        <w:t xml:space="preserve">500 dpi </w:t>
+      </w:r>
+      <w:r>
+        <w:rPr>
+          <w:rFonts w:ascii="TH SarabunPSK" w:hAnsi="TH SarabunPSK" w:cs="TH SarabunPSK"/>
+          <w:sz w:val="32"/>
+          <w:szCs w:val="32"/>
+          <w:cs/>
+        </w:rPr>
+        <w:t xml:space="preserve">ใช้เวลาในการจับภาพไม่ถึง </w:t>
+      </w:r>
+      <w:r>
+        <w:rPr>
+          <w:rFonts w:ascii="TH SarabunPSK" w:hAnsi="TH SarabunPSK" w:cs="TH SarabunPSK"/>
+          <w:sz w:val="32"/>
+          <w:szCs w:val="32"/>
+        </w:rPr>
+        <w:t xml:space="preserve">1 </w:t>
+      </w:r>
+      <w:r>
+        <w:rPr>
+          <w:rFonts w:ascii="TH SarabunPSK" w:hAnsi="TH SarabunPSK" w:cs="TH SarabunPSK"/>
+          <w:sz w:val="32"/>
+          <w:szCs w:val="32"/>
+          <w:cs/>
+        </w:rPr>
+        <w:t>วินาที และมีอัตราความผิดพลาดต่ำ (</w:t>
+      </w:r>
+      <w:r>
+        <w:rPr>
+          <w:rFonts w:ascii="TH SarabunPSK" w:hAnsi="TH SarabunPSK" w:cs="TH SarabunPSK"/>
+          <w:sz w:val="32"/>
+          <w:szCs w:val="32"/>
+        </w:rPr>
+        <w:t xml:space="preserve">FAR &lt; 0.001%, FRR &lt; 1%) </w:t>
+      </w:r>
+      <w:r>
+        <w:rPr>
+          <w:rFonts w:ascii="TH SarabunPSK" w:hAnsi="TH SarabunPSK" w:cs="TH SarabunPSK"/>
+          <w:sz w:val="32"/>
+          <w:szCs w:val="32"/>
+          <w:cs/>
+        </w:rPr>
+        <w:t>จุดเด่นคือใช้งานง่าย ความแม่นยำสูง และมีฟังก์ชันครบในตัว เหมาะสำหรับระบบรักษาความปลอดภัยหรือระบบควบคุมการเข้าออก อย่างไรก็ตาม ควรหลีกเลี่ยงการให้เลนส์สแกนสกปรกหรือมีฝุ่น เพราะอาจทำให้การจับภาพลายนิ้วมือไม่สมบูรณ์ และต้องใช้ไฟเลี้ยงที่เสถียรเพื่อให้การทำงานมีความน่าเชื่อถือ</w:t>
+      </w:r>
+    </w:p>
+    <w:p>
+      <w:pPr>
+        <w:rPr>
+          <w:rFonts w:ascii="TH SarabunPSK" w:hAnsi="TH SarabunPSK" w:cs="TH SarabunPSK"/>
+          <w:sz w:val="32"/>
+          <w:szCs w:val="32"/>
+        </w:rPr>
+      </w:pPr>
+      <w:r>
+        <w:rPr>
+          <w:noProof/>
+        </w:rPr>
+        <w:drawing>
+          <wp:anchor distT="0" distB="0" distL="114300" distR="114300" simplePos="0" relativeHeight="251736064" behindDoc="0" locked="0" layoutInCell="1" allowOverlap="1" wp14:anchorId="6A82BCD9" wp14:editId="70D73069">
+            <wp:simplePos x="0" y="0"/>
+            <wp:positionH relativeFrom="column">
+              <wp:posOffset>1790701</wp:posOffset>
+            </wp:positionH>
+            <wp:positionV relativeFrom="paragraph">
+              <wp:posOffset>100331</wp:posOffset>
+            </wp:positionV>
+            <wp:extent cx="2179320" cy="2047240"/>
+            <wp:effectExtent l="0" t="0" r="0" b="0"/>
+            <wp:wrapNone/>
+            <wp:docPr id="11" name="รูปภาพ 11" descr="Buy AS608 Optical Fingerprint Sensor Fingerprint Module Online at Robu.in"/>
+            <wp:cNvGraphicFramePr>
+              <a:graphicFrameLocks xmlns:a="http://schemas.openxmlformats.org/drawingml/2006/main" noChangeAspect="1"/>
+            </wp:cNvGraphicFramePr>
+            <a:graphic xmlns:a="http://schemas.openxmlformats.org/drawingml/2006/main">
+              <a:graphicData uri="http://schemas.openxmlformats.org/drawingml/2006/picture">
+                <pic:pic xmlns:pic="http://schemas.openxmlformats.org/drawingml/2006/picture">
+                  <pic:nvPicPr>
+                    <pic:cNvPr id="0" name="Picture 13" descr="Buy AS608 Optical Fingerprint Sensor Fingerprint Module Online at Robu.in"/>
+                    <pic:cNvPicPr>
+                      <a:picLocks noChangeAspect="1" noChangeArrowheads="1"/>
+                    </pic:cNvPicPr>
+                  </pic:nvPicPr>
+                  <pic:blipFill rotWithShape="1">
+                    <a:blip r:embed="rId18">
+                      <a:extLst>
+                        <a:ext uri="{28A0092B-C50C-407E-A947-70E740481C1C}">
+                          <a14:useLocalDpi xmlns:a14="http://schemas.microsoft.com/office/drawing/2010/main" val="0"/>
+                        </a:ext>
+                      </a:extLst>
+                    </a:blip>
+                    <a:srcRect l="21139" t="16752" r="21826" b="29670"/>
+                    <a:stretch/>
+                  </pic:blipFill>
+                  <pic:spPr bwMode="auto">
+                    <a:xfrm>
+                      <a:off x="0" y="0"/>
+                      <a:ext cx="2180363" cy="2048220"/>
+                    </a:xfrm>
+                    <a:prstGeom prst="rect">
+                      <a:avLst/>
+                    </a:prstGeom>
+                    <a:noFill/>
+                    <a:ln>
+                      <a:noFill/>
+                    </a:ln>
+                    <a:extLst>
+                      <a:ext uri="{53640926-AAD7-44D8-BBD7-CCE9431645EC}">
+                        <a14:shadowObscured xmlns:a14="http://schemas.microsoft.com/office/drawing/2010/main"/>
+                      </a:ext>
+                    </a:extLst>
+                  </pic:spPr>
+                </pic:pic>
+              </a:graphicData>
+            </a:graphic>
+            <wp14:sizeRelH relativeFrom="page">
+              <wp14:pctWidth>0</wp14:pctWidth>
+            </wp14:sizeRelH>
+            <wp14:sizeRelV relativeFrom="page">
+              <wp14:pctHeight>0</wp14:pctHeight>
+            </wp14:sizeRelV>
+          </wp:anchor>
+        </w:drawing>
+      </w:r>
+    </w:p>
+    <w:p>
+      <w:pPr>
+        <w:rPr>
+          <w:rFonts w:ascii="TH SarabunPSK" w:hAnsi="TH SarabunPSK" w:cs="TH SarabunPSK"/>
+          <w:sz w:val="32"/>
+          <w:szCs w:val="32"/>
+        </w:rPr>
+      </w:pPr>
+    </w:p>
+    <w:p>
+      <w:pPr>
+        <w:rPr>
+          <w:rFonts w:ascii="TH SarabunPSK" w:hAnsi="TH SarabunPSK" w:cs="TH SarabunPSK"/>
+          <w:sz w:val="32"/>
+          <w:szCs w:val="32"/>
+        </w:rPr>
+      </w:pPr>
+    </w:p>
+    <w:p>
+      <w:pPr>
+        <w:rPr>
+          <w:rFonts w:ascii="TH SarabunPSK" w:hAnsi="TH SarabunPSK" w:cs="TH SarabunPSK"/>
+          <w:sz w:val="32"/>
+          <w:szCs w:val="32"/>
+        </w:rPr>
+      </w:pPr>
+    </w:p>
+    <w:p>
+      <w:pPr>
+        <w:rPr>
+          <w:rFonts w:ascii="TH SarabunPSK" w:hAnsi="TH SarabunPSK" w:cs="TH SarabunPSK" w:hint="cs"/>
+          <w:sz w:val="32"/>
+          <w:szCs w:val="32"/>
+          <w:cs/>
+        </w:rPr>
+      </w:pPr>
+    </w:p>
+    <w:p>
+      <w:pPr>
+        <w:rPr>
+          <w:rFonts w:ascii="TH SarabunPSK" w:hAnsi="TH SarabunPSK" w:cs="TH SarabunPSK"/>
+          <w:sz w:val="32"/>
+          <w:szCs w:val="32"/>
+        </w:rPr>
+      </w:pPr>
+    </w:p>
+    <w:p>
+      <w:pPr>
+        <w:rPr>
+          <w:rFonts w:ascii="TH SarabunPSK" w:hAnsi="TH SarabunPSK" w:cs="TH SarabunPSK"/>
+          <w:sz w:val="32"/>
+          <w:szCs w:val="32"/>
+        </w:rPr>
+      </w:pPr>
+    </w:p>
+    <w:p>
+      <w:pPr>
+        <w:rPr>
+          <w:rFonts w:ascii="TH SarabunPSK" w:hAnsi="TH SarabunPSK" w:cs="TH SarabunPSK"/>
+          <w:sz w:val="32"/>
+          <w:szCs w:val="32"/>
+        </w:rPr>
+      </w:pPr>
+    </w:p>
+    <w:p>
+      <w:pPr>
+        <w:rPr>
+          <w:rFonts w:ascii="TH SarabunPSK" w:hAnsi="TH SarabunPSK" w:cs="TH SarabunPSK"/>
+          <w:sz w:val="32"/>
+          <w:szCs w:val="32"/>
+        </w:rPr>
+      </w:pPr>
+      <w:r>
+        <w:rPr>
+          <w:rFonts w:ascii="TH SarabunPSK" w:hAnsi="TH SarabunPSK" w:cs="TH SarabunPSK" w:hint="cs"/>
+          <w:b/>
+          <w:bCs/>
+          <w:sz w:val="32"/>
+          <w:szCs w:val="32"/>
+          <w:cs/>
+        </w:rPr>
+        <w:t>9.</w:t>
+      </w:r>
+      <w:r>
+        <w:rPr>
+          <w:rFonts w:ascii="TH SarabunPSK" w:hAnsi="TH SarabunPSK" w:cs="TH SarabunPSK" w:hint="cs"/>
+          <w:b/>
+          <w:bCs/>
+          <w:sz w:val="32"/>
+          <w:szCs w:val="32"/>
+          <w:cs/>
+        </w:rPr>
+        <w:t xml:space="preserve"> </w:t>
+      </w:r>
+      <w:r>
+        <w:rPr>
+          <w:rFonts w:ascii="TH SarabunPSK" w:hAnsi="TH SarabunPSK" w:cs="TH SarabunPSK"/>
+          <w:b/>
+          <w:bCs/>
+          <w:sz w:val="32"/>
+          <w:szCs w:val="32"/>
+          <w:cs/>
+        </w:rPr>
+        <w:t xml:space="preserve">โมดูล </w:t>
+      </w:r>
+      <w:r>
+        <w:rPr>
+          <w:rFonts w:ascii="TH SarabunPSK" w:hAnsi="TH SarabunPSK" w:cs="TH SarabunPSK"/>
+          <w:b/>
+          <w:bCs/>
+          <w:sz w:val="32"/>
+          <w:szCs w:val="32"/>
+        </w:rPr>
+        <w:t>Micro SD Card Module</w:t>
+      </w:r>
+      <w:r>
+        <w:rPr>
+          <w:rFonts w:ascii="TH SarabunPSK" w:hAnsi="TH SarabunPSK" w:cs="TH SarabunPSK"/>
+          <w:b/>
+          <w:bCs/>
+          <w:sz w:val="32"/>
+          <w:szCs w:val="32"/>
+        </w:rPr>
+        <w:t xml:space="preserve"> :</w:t>
+      </w:r>
+      <w:r>
+        <w:rPr>
+          <w:rFonts w:ascii="TH SarabunPSK" w:hAnsi="TH SarabunPSK" w:cs="TH SarabunPSK"/>
+          <w:sz w:val="32"/>
+          <w:szCs w:val="32"/>
+        </w:rPr>
+        <w:t xml:space="preserve"> </w:t>
+      </w:r>
+      <w:r>
+        <w:rPr>
+          <w:rFonts w:ascii="TH SarabunPSK" w:hAnsi="TH SarabunPSK" w:cs="TH SarabunPSK"/>
+          <w:sz w:val="32"/>
+          <w:szCs w:val="32"/>
+          <w:cs/>
+        </w:rPr>
+        <w:t xml:space="preserve">เป็นบอร์ดเสริมที่ใช้สำหรับเชื่อมต่อไมโครคอนโทรลเลอร์กับ </w:t>
+      </w:r>
+      <w:r>
+        <w:rPr>
+          <w:rFonts w:ascii="TH SarabunPSK" w:hAnsi="TH SarabunPSK" w:cs="TH SarabunPSK"/>
+          <w:sz w:val="32"/>
+          <w:szCs w:val="32"/>
+        </w:rPr>
+        <w:t xml:space="preserve">microSD </w:t>
+      </w:r>
+      <w:r>
+        <w:rPr>
+          <w:rFonts w:ascii="TH SarabunPSK" w:hAnsi="TH SarabunPSK" w:cs="TH SarabunPSK"/>
+          <w:sz w:val="32"/>
+          <w:szCs w:val="32"/>
+        </w:rPr>
+        <w:t xml:space="preserve">Card </w:t>
+      </w:r>
+      <w:r>
+        <w:rPr>
+          <w:rFonts w:ascii="TH SarabunPSK" w:hAnsi="TH SarabunPSK" w:cs="TH SarabunPSK"/>
+          <w:sz w:val="32"/>
+          <w:szCs w:val="32"/>
+          <w:cs/>
+        </w:rPr>
+        <w:t>ได้อย่างสะดวก โดยใช้การสื่อสารผ่านอินเทอร</w:t>
+      </w:r>
+      <w:proofErr w:type="spellStart"/>
+      <w:r>
+        <w:rPr>
+          <w:rFonts w:ascii="TH SarabunPSK" w:hAnsi="TH SarabunPSK" w:cs="TH SarabunPSK"/>
+          <w:sz w:val="32"/>
+          <w:szCs w:val="32"/>
+          <w:cs/>
+        </w:rPr>
+        <w:t>์เฟซ</w:t>
+      </w:r>
+      <w:proofErr w:type="spellEnd"/>
+      <w:r>
+        <w:rPr>
+          <w:rFonts w:ascii="TH SarabunPSK" w:hAnsi="TH SarabunPSK" w:cs="TH SarabunPSK"/>
+          <w:sz w:val="32"/>
+          <w:szCs w:val="32"/>
+          <w:cs/>
+        </w:rPr>
+        <w:t xml:space="preserve">แบบ </w:t>
+      </w:r>
+      <w:r>
+        <w:rPr>
+          <w:rFonts w:ascii="TH SarabunPSK" w:hAnsi="TH SarabunPSK" w:cs="TH SarabunPSK"/>
+          <w:sz w:val="32"/>
+          <w:szCs w:val="32"/>
+        </w:rPr>
+        <w:t xml:space="preserve">SPI </w:t>
+      </w:r>
+      <w:r>
+        <w:rPr>
+          <w:rFonts w:ascii="TH SarabunPSK" w:hAnsi="TH SarabunPSK" w:cs="TH SarabunPSK"/>
+          <w:sz w:val="32"/>
+          <w:szCs w:val="32"/>
+          <w:cs/>
+        </w:rPr>
+        <w:t xml:space="preserve">ซึ่งเป็นมาตรฐานที่รองรับโดยบอร์ดยอดนิยมอย่าง </w:t>
+      </w:r>
+      <w:r>
+        <w:rPr>
+          <w:rFonts w:ascii="TH SarabunPSK" w:hAnsi="TH SarabunPSK" w:cs="TH SarabunPSK"/>
+          <w:sz w:val="32"/>
+          <w:szCs w:val="32"/>
+        </w:rPr>
+        <w:t xml:space="preserve">Arduino, ESP32 </w:t>
+      </w:r>
+      <w:r>
+        <w:rPr>
+          <w:rFonts w:ascii="TH SarabunPSK" w:hAnsi="TH SarabunPSK" w:cs="TH SarabunPSK"/>
+          <w:sz w:val="32"/>
+          <w:szCs w:val="32"/>
+          <w:cs/>
+        </w:rPr>
+        <w:t xml:space="preserve">และ </w:t>
+      </w:r>
+      <w:r>
+        <w:rPr>
+          <w:rFonts w:ascii="TH SarabunPSK" w:hAnsi="TH SarabunPSK" w:cs="TH SarabunPSK"/>
+          <w:sz w:val="32"/>
+          <w:szCs w:val="32"/>
+        </w:rPr>
+        <w:t xml:space="preserve">STM32 </w:t>
+      </w:r>
+      <w:r>
+        <w:rPr>
+          <w:rFonts w:ascii="TH SarabunPSK" w:hAnsi="TH SarabunPSK" w:cs="TH SarabunPSK"/>
+          <w:sz w:val="32"/>
+          <w:szCs w:val="32"/>
+          <w:cs/>
+        </w:rPr>
+        <w:t xml:space="preserve">ภายในโมดูลมีวงจรแปลงแรงดันและตัวควบคุมแรงดันในตัว ทำให้สามารถจ่ายไฟจาก </w:t>
+      </w:r>
+      <w:r>
+        <w:rPr>
+          <w:rFonts w:ascii="TH SarabunPSK" w:hAnsi="TH SarabunPSK" w:cs="TH SarabunPSK"/>
+          <w:sz w:val="32"/>
+          <w:szCs w:val="32"/>
+        </w:rPr>
+        <w:t xml:space="preserve">4.5 – 5.5 V </w:t>
+      </w:r>
+      <w:r>
+        <w:rPr>
+          <w:rFonts w:ascii="TH SarabunPSK" w:hAnsi="TH SarabunPSK" w:cs="TH SarabunPSK"/>
+          <w:sz w:val="32"/>
+          <w:szCs w:val="32"/>
+          <w:cs/>
+        </w:rPr>
+        <w:t xml:space="preserve">ได้โดยไม่เป็นอันตรายต่อการ์ดที่ใช้แรงดัน </w:t>
+      </w:r>
+      <w:r>
+        <w:rPr>
+          <w:rFonts w:ascii="TH SarabunPSK" w:hAnsi="TH SarabunPSK" w:cs="TH SarabunPSK"/>
+          <w:sz w:val="32"/>
+          <w:szCs w:val="32"/>
+        </w:rPr>
+        <w:t xml:space="preserve">3.3 V </w:t>
+      </w:r>
+      <w:r>
+        <w:rPr>
+          <w:rFonts w:ascii="TH SarabunPSK" w:hAnsi="TH SarabunPSK" w:cs="TH SarabunPSK"/>
+          <w:sz w:val="32"/>
+          <w:szCs w:val="32"/>
+          <w:cs/>
+        </w:rPr>
+        <w:t xml:space="preserve">อีกทั้งยังรองรับการ์ดแบบ </w:t>
+      </w:r>
+      <w:r>
+        <w:rPr>
+          <w:rFonts w:ascii="TH SarabunPSK" w:hAnsi="TH SarabunPSK" w:cs="TH SarabunPSK"/>
+          <w:sz w:val="32"/>
+          <w:szCs w:val="32"/>
+        </w:rPr>
+        <w:t xml:space="preserve">SDHC </w:t>
+      </w:r>
+      <w:r>
+        <w:rPr>
+          <w:rFonts w:ascii="TH SarabunPSK" w:hAnsi="TH SarabunPSK" w:cs="TH SarabunPSK"/>
+          <w:sz w:val="32"/>
+          <w:szCs w:val="32"/>
+          <w:cs/>
+        </w:rPr>
+        <w:t xml:space="preserve">และมีรูยึดให้ติดตั้งได้ง่าย การใช้งานเพียงเชื่อมต่อขา </w:t>
+      </w:r>
+      <w:r>
+        <w:rPr>
+          <w:rFonts w:ascii="TH SarabunPSK" w:hAnsi="TH SarabunPSK" w:cs="TH SarabunPSK"/>
+          <w:sz w:val="32"/>
+          <w:szCs w:val="32"/>
+        </w:rPr>
+        <w:t xml:space="preserve">CS/SS, MOSI, MISO </w:t>
+      </w:r>
+      <w:r>
+        <w:rPr>
+          <w:rFonts w:ascii="TH SarabunPSK" w:hAnsi="TH SarabunPSK" w:cs="TH SarabunPSK"/>
+          <w:sz w:val="32"/>
+          <w:szCs w:val="32"/>
+          <w:cs/>
+        </w:rPr>
+        <w:t xml:space="preserve">และ </w:t>
+      </w:r>
+      <w:r>
+        <w:rPr>
+          <w:rFonts w:ascii="TH SarabunPSK" w:hAnsi="TH SarabunPSK" w:cs="TH SarabunPSK"/>
+          <w:sz w:val="32"/>
+          <w:szCs w:val="32"/>
+        </w:rPr>
+        <w:t xml:space="preserve">SCK </w:t>
+      </w:r>
+      <w:r>
+        <w:rPr>
+          <w:rFonts w:ascii="TH SarabunPSK" w:hAnsi="TH SarabunPSK" w:cs="TH SarabunPSK"/>
+          <w:sz w:val="32"/>
+          <w:szCs w:val="32"/>
+          <w:cs/>
+        </w:rPr>
+        <w:t>เข้ากับไมโครคอนโทรลเลอร์ก็สามารถอ่าน-เขียนข้อมูลได้ทันที โมดูลนี้จึงเหมาะสำหรับงานบันทึกข้อมูล เซนเซอร์ล็อก และโปรเจก</w:t>
+      </w:r>
+      <w:proofErr w:type="spellStart"/>
+      <w:r>
+        <w:rPr>
+          <w:rFonts w:ascii="TH SarabunPSK" w:hAnsi="TH SarabunPSK" w:cs="TH SarabunPSK"/>
+          <w:sz w:val="32"/>
+          <w:szCs w:val="32"/>
+          <w:cs/>
+        </w:rPr>
+        <w:t>ต์</w:t>
+      </w:r>
+      <w:proofErr w:type="spellEnd"/>
+      <w:r>
+        <w:rPr>
+          <w:rFonts w:ascii="TH SarabunPSK" w:hAnsi="TH SarabunPSK" w:cs="TH SarabunPSK"/>
+          <w:sz w:val="32"/>
+          <w:szCs w:val="32"/>
+          <w:cs/>
+        </w:rPr>
+        <w:t>ที่ต้องการจัดเก็บข้อมูลในรูปแบบไฟล์ได้อย่างง่ายดายและต้นทุนต่ำ</w:t>
+      </w:r>
+    </w:p>
+    <w:p>
+      <w:pPr>
+        <w:rPr>
+          <w:rFonts w:ascii="TH SarabunPSK" w:hAnsi="TH SarabunPSK" w:cs="TH SarabunPSK"/>
+          <w:sz w:val="32"/>
+          <w:szCs w:val="32"/>
+        </w:rPr>
+      </w:pPr>
+      <w:r>
+        <w:rPr>
+          <w:noProof/>
+        </w:rPr>
+        <w:drawing>
+          <wp:anchor distT="0" distB="0" distL="114300" distR="114300" simplePos="0" relativeHeight="251737088" behindDoc="0" locked="0" layoutInCell="1" allowOverlap="1" wp14:anchorId="0045F8BB" wp14:editId="0AC17155">
+            <wp:simplePos x="0" y="0"/>
+            <wp:positionH relativeFrom="column">
+              <wp:posOffset>1455420</wp:posOffset>
+            </wp:positionH>
+            <wp:positionV relativeFrom="paragraph">
+              <wp:posOffset>35560</wp:posOffset>
+            </wp:positionV>
+            <wp:extent cx="2720340" cy="1539382"/>
+            <wp:effectExtent l="0" t="0" r="3810" b="3810"/>
+            <wp:wrapNone/>
+            <wp:docPr id="12" name="รูปภาพ 12" descr="Micro SD Card Mini TF Card Reader Module"/>
+            <wp:cNvGraphicFramePr>
+              <a:graphicFrameLocks xmlns:a="http://schemas.openxmlformats.org/drawingml/2006/main" noChangeAspect="1"/>
+            </wp:cNvGraphicFramePr>
+            <a:graphic xmlns:a="http://schemas.openxmlformats.org/drawingml/2006/main">
+              <a:graphicData uri="http://schemas.openxmlformats.org/drawingml/2006/picture">
+                <pic:pic xmlns:pic="http://schemas.openxmlformats.org/drawingml/2006/picture">
+                  <pic:nvPicPr>
+                    <pic:cNvPr id="0" name="Picture 15" descr="Micro SD Card Mini TF Card Reader Module"/>
+                    <pic:cNvPicPr>
+                      <a:picLocks noChangeAspect="1" noChangeArrowheads="1"/>
+                    </pic:cNvPicPr>
+                  </pic:nvPicPr>
+                  <pic:blipFill rotWithShape="1">
+                    <a:blip r:embed="rId19">
+                      <a:extLst>
+                        <a:ext uri="{28A0092B-C50C-407E-A947-70E740481C1C}">
+                          <a14:useLocalDpi xmlns:a14="http://schemas.microsoft.com/office/drawing/2010/main" val="0"/>
+                        </a:ext>
+                      </a:extLst>
+                    </a:blip>
+                    <a:srcRect l="9573" t="28584" r="11722" b="26878"/>
+                    <a:stretch/>
+                  </pic:blipFill>
+                  <pic:spPr bwMode="auto">
+                    <a:xfrm>
+                      <a:off x="0" y="0"/>
+                      <a:ext cx="2720340" cy="1539382"/>
+                    </a:xfrm>
+                    <a:prstGeom prst="rect">
+                      <a:avLst/>
+                    </a:prstGeom>
+                    <a:noFill/>
+                    <a:ln>
+                      <a:noFill/>
+                    </a:ln>
+                    <a:extLst>
+                      <a:ext uri="{53640926-AAD7-44D8-BBD7-CCE9431645EC}">
+                        <a14:shadowObscured xmlns:a14="http://schemas.microsoft.com/office/drawing/2010/main"/>
+                      </a:ext>
+                    </a:extLst>
+                  </pic:spPr>
+                </pic:pic>
+              </a:graphicData>
+            </a:graphic>
+            <wp14:sizeRelH relativeFrom="page">
+              <wp14:pctWidth>0</wp14:pctWidth>
+            </wp14:sizeRelH>
+            <wp14:sizeRelV relativeFrom="page">
+              <wp14:pctHeight>0</wp14:pctHeight>
+            </wp14:sizeRelV>
+          </wp:anchor>
+        </w:drawing>
+      </w:r>
+    </w:p>
+    <w:p>
+      <w:pPr>
+        <w:rPr>
+          <w:rFonts w:ascii="TH SarabunPSK" w:hAnsi="TH SarabunPSK" w:cs="TH SarabunPSK"/>
+          <w:sz w:val="32"/>
+          <w:szCs w:val="32"/>
+        </w:rPr>
+      </w:pPr>
+    </w:p>
+    <w:p>
+      <w:pPr>
+        <w:rPr>
+          <w:rFonts w:ascii="TH SarabunPSK" w:hAnsi="TH SarabunPSK" w:cs="TH SarabunPSK"/>
+          <w:sz w:val="32"/>
+          <w:szCs w:val="32"/>
+        </w:rPr>
+      </w:pPr>
+    </w:p>
+    <w:p>
+      <w:pPr>
+        <w:rPr>
+          <w:rFonts w:ascii="TH SarabunPSK" w:hAnsi="TH SarabunPSK" w:cs="TH SarabunPSK"/>
+          <w:sz w:val="32"/>
+          <w:szCs w:val="32"/>
+        </w:rPr>
+      </w:pPr>
+    </w:p>
+    <w:p>
+      <w:pPr>
+        <w:rPr>
+          <w:rFonts w:ascii="TH SarabunPSK" w:hAnsi="TH SarabunPSK" w:cs="TH SarabunPSK"/>
+          <w:sz w:val="32"/>
+          <w:szCs w:val="32"/>
+        </w:rPr>
+      </w:pPr>
+    </w:p>
+    <w:p>
+      <w:pPr>
+        <w:rPr>
+          <w:rFonts w:ascii="TH SarabunPSK" w:hAnsi="TH SarabunPSK" w:cs="TH SarabunPSK"/>
+          <w:sz w:val="32"/>
+          <w:szCs w:val="32"/>
+        </w:rPr>
+      </w:pPr>
+    </w:p>
+    <w:p>
+      <w:pPr>
+        <w:rPr>
+          <w:rFonts w:ascii="TH SarabunPSK" w:hAnsi="TH SarabunPSK" w:cs="TH SarabunPSK"/>
+          <w:sz w:val="32"/>
+          <w:szCs w:val="32"/>
+        </w:rPr>
+      </w:pPr>
+    </w:p>
+    <w:p>
+      <w:pPr>
+        <w:rPr>
+          <w:rFonts w:ascii="TH SarabunPSK" w:hAnsi="TH SarabunPSK" w:cs="TH SarabunPSK"/>
+          <w:sz w:val="32"/>
+          <w:szCs w:val="32"/>
+        </w:rPr>
+      </w:pPr>
+    </w:p>
+    <w:p>
+      <w:pPr>
+        <w:rPr>
+          <w:rFonts w:ascii="TH SarabunPSK" w:hAnsi="TH SarabunPSK" w:cs="TH SarabunPSK"/>
+          <w:sz w:val="32"/>
+          <w:szCs w:val="32"/>
+        </w:rPr>
+      </w:pPr>
+    </w:p>
+    <w:p>
+      <w:pPr>
+        <w:rPr>
+          <w:rFonts w:ascii="TH SarabunPSK" w:hAnsi="TH SarabunPSK" w:cs="TH SarabunPSK"/>
+          <w:sz w:val="32"/>
+          <w:szCs w:val="32"/>
+        </w:rPr>
+      </w:pPr>
+    </w:p>
+    <w:p>
+      <w:pPr>
+        <w:rPr>
+          <w:rFonts w:ascii="TH SarabunPSK" w:hAnsi="TH SarabunPSK" w:cs="TH SarabunPSK"/>
+          <w:sz w:val="32"/>
+          <w:szCs w:val="32"/>
+        </w:rPr>
+      </w:pPr>
+    </w:p>
+    <w:p>
+      <w:pPr>
+        <w:rPr>
+          <w:rFonts w:ascii="TH SarabunPSK" w:hAnsi="TH SarabunPSK" w:cs="TH SarabunPSK"/>
+          <w:sz w:val="32"/>
+          <w:szCs w:val="32"/>
+        </w:rPr>
+      </w:pPr>
+    </w:p>
+    <w:p>
+      <w:pPr>
+        <w:rPr>
+          <w:rFonts w:ascii="TH SarabunPSK" w:hAnsi="TH SarabunPSK" w:cs="TH SarabunPSK"/>
+          <w:sz w:val="32"/>
+          <w:szCs w:val="32"/>
+        </w:rPr>
+      </w:pPr>
+    </w:p>
+    <w:p>
+      <w:pPr>
+        <w:rPr>
+          <w:rFonts w:ascii="TH SarabunPSK" w:hAnsi="TH SarabunPSK" w:cs="TH SarabunPSK"/>
+          <w:b/>
+          <w:bCs/>
+          <w:sz w:val="32"/>
+          <w:szCs w:val="32"/>
+        </w:rPr>
+      </w:pPr>
+      <w:r>
+        <w:rPr>
+          <w:rFonts w:ascii="TH SarabunPSK" w:hAnsi="TH SarabunPSK" w:cs="TH SarabunPSK" w:hint="cs"/>
+          <w:b/>
+          <w:bCs/>
+          <w:sz w:val="32"/>
+          <w:szCs w:val="32"/>
+          <w:cs/>
+        </w:rPr>
+        <w:t>ตาราง</w:t>
+      </w:r>
+      <w:r>
+        <w:rPr>
+          <w:rFonts w:ascii="TH SarabunPSK" w:hAnsi="TH SarabunPSK" w:cs="TH SarabunPSK"/>
+          <w:b/>
+          <w:bCs/>
+          <w:sz w:val="32"/>
+          <w:szCs w:val="32"/>
+          <w:cs/>
+        </w:rPr>
         <w:t>อุปกรณ์ที่ใช้</w:t>
       </w:r>
+    </w:p>
+    <w:p>
+      <w:pPr>
+        <w:rPr>
+          <w:rFonts w:ascii="TH SarabunPSK" w:hAnsi="TH SarabunPSK" w:cs="TH SarabunPSK" w:hint="cs"/>
+          <w:sz w:val="32"/>
+          <w:szCs w:val="32"/>
+        </w:rPr>
+      </w:pPr>
     </w:p>
     <w:tbl>
       <w:tblPr>
@@ -2581,7 +5578,7 @@
             <w:pPr>
               <w:jc w:val="center"/>
               <w:rPr>
-                <w:rFonts w:ascii="TH SarabunPSK" w:hAnsi="TH SarabunPSK" w:cs="TH SarabunPSK" w:hint="cs"/>
+                <w:rFonts w:ascii="TH SarabunPSK" w:hAnsi="TH SarabunPSK" w:cs="TH SarabunPSK"/>
                 <w:sz w:val="32"/>
                 <w:szCs w:val="32"/>
                 <w:cs/>
@@ -2671,7 +5668,7 @@
             <w:pPr>
               <w:jc w:val="center"/>
               <w:rPr>
-                <w:rFonts w:ascii="TH SarabunPSK" w:hAnsi="TH SarabunPSK" w:cs="TH SarabunPSK" w:hint="cs"/>
+                <w:rFonts w:ascii="TH SarabunPSK" w:hAnsi="TH SarabunPSK" w:cs="TH SarabunPSK"/>
                 <w:sz w:val="32"/>
                 <w:szCs w:val="32"/>
                 <w:cs/>
@@ -2761,7 +5758,7 @@
             <w:pPr>
               <w:jc w:val="center"/>
               <w:rPr>
-                <w:rFonts w:ascii="TH SarabunPSK" w:hAnsi="TH SarabunPSK" w:cs="TH SarabunPSK" w:hint="cs"/>
+                <w:rFonts w:ascii="TH SarabunPSK" w:hAnsi="TH SarabunPSK" w:cs="TH SarabunPSK"/>
                 <w:sz w:val="32"/>
                 <w:szCs w:val="32"/>
               </w:rPr>
@@ -3521,7 +6518,7 @@
             <w:pPr>
               <w:jc w:val="center"/>
               <w:rPr>
-                <w:rFonts w:ascii="TH SarabunPSK" w:hAnsi="TH SarabunPSK" w:cs="TH SarabunPSK" w:hint="cs"/>
+                <w:rFonts w:ascii="TH SarabunPSK" w:hAnsi="TH SarabunPSK" w:cs="TH SarabunPSK"/>
                 <w:sz w:val="32"/>
                 <w:szCs w:val="32"/>
                 <w:cs/>
@@ -3579,7 +6576,7 @@
             <w:pPr>
               <w:jc w:val="center"/>
               <w:rPr>
-                <w:rFonts w:ascii="TH SarabunPSK" w:hAnsi="TH SarabunPSK" w:cs="TH SarabunPSK" w:hint="cs"/>
+                <w:rFonts w:ascii="TH SarabunPSK" w:hAnsi="TH SarabunPSK" w:cs="TH SarabunPSK"/>
                 <w:sz w:val="32"/>
                 <w:szCs w:val="32"/>
               </w:rPr>
@@ -3753,7 +6750,7 @@
             <w:pPr>
               <w:jc w:val="center"/>
               <w:rPr>
-                <w:rFonts w:ascii="TH SarabunPSK" w:hAnsi="TH SarabunPSK" w:cs="TH SarabunPSK" w:hint="cs"/>
+                <w:rFonts w:ascii="TH SarabunPSK" w:hAnsi="TH SarabunPSK" w:cs="TH SarabunPSK"/>
                 <w:sz w:val="32"/>
                 <w:szCs w:val="32"/>
                 <w:cs/>
@@ -3975,7 +6972,7 @@
             <w:pPr>
               <w:jc w:val="center"/>
               <w:rPr>
-                <w:rFonts w:ascii="TH SarabunPSK" w:hAnsi="TH SarabunPSK" w:cs="TH SarabunPSK" w:hint="cs"/>
+                <w:rFonts w:ascii="TH SarabunPSK" w:hAnsi="TH SarabunPSK" w:cs="TH SarabunPSK"/>
                 <w:sz w:val="32"/>
                 <w:szCs w:val="32"/>
                 <w:cs/>
@@ -4021,6 +7018,7 @@
                 <w:sz w:val="32"/>
                 <w:szCs w:val="32"/>
               </w:rPr>
+              <w:lastRenderedPageBreak/>
               <w:t>18.</w:t>
             </w:r>
           </w:p>
@@ -4056,7 +7054,7 @@
             <w:pPr>
               <w:jc w:val="center"/>
               <w:rPr>
-                <w:rFonts w:ascii="TH SarabunPSK" w:hAnsi="TH SarabunPSK" w:cs="TH SarabunPSK" w:hint="cs"/>
+                <w:rFonts w:ascii="TH SarabunPSK" w:hAnsi="TH SarabunPSK" w:cs="TH SarabunPSK"/>
                 <w:sz w:val="32"/>
                 <w:szCs w:val="32"/>
                 <w:cs/>
@@ -4119,13 +7117,23 @@
                 <w:szCs w:val="32"/>
               </w:rPr>
             </w:pPr>
+            <w:proofErr w:type="spellStart"/>
             <w:r>
               <w:rPr>
                 <w:rFonts w:ascii="TH SarabunPSK" w:hAnsi="TH SarabunPSK" w:cs="TH SarabunPSK"/>
                 <w:sz w:val="32"/>
                 <w:szCs w:val="32"/>
               </w:rPr>
-              <w:t>Odroid C4</w:t>
+              <w:t>Odroid</w:t>
+            </w:r>
+            <w:proofErr w:type="spellEnd"/>
+            <w:r>
+              <w:rPr>
+                <w:rFonts w:ascii="TH SarabunPSK" w:hAnsi="TH SarabunPSK" w:cs="TH SarabunPSK"/>
+                <w:sz w:val="32"/>
+                <w:szCs w:val="32"/>
+              </w:rPr>
+              <w:t xml:space="preserve"> C4</w:t>
             </w:r>
           </w:p>
         </w:tc>
@@ -4137,7 +7145,7 @@
             <w:pPr>
               <w:jc w:val="center"/>
               <w:rPr>
-                <w:rFonts w:ascii="TH SarabunPSK" w:hAnsi="TH SarabunPSK" w:cs="TH SarabunPSK" w:hint="cs"/>
+                <w:rFonts w:ascii="TH SarabunPSK" w:hAnsi="TH SarabunPSK" w:cs="TH SarabunPSK"/>
                 <w:sz w:val="32"/>
                 <w:szCs w:val="32"/>
                 <w:cs/>
@@ -4218,7 +7226,7 @@
             <w:pPr>
               <w:jc w:val="center"/>
               <w:rPr>
-                <w:rFonts w:ascii="TH SarabunPSK" w:hAnsi="TH SarabunPSK" w:cs="TH SarabunPSK" w:hint="cs"/>
+                <w:rFonts w:ascii="TH SarabunPSK" w:hAnsi="TH SarabunPSK" w:cs="TH SarabunPSK"/>
                 <w:sz w:val="32"/>
                 <w:szCs w:val="32"/>
                 <w:cs/>
@@ -4356,7 +7364,7 @@
             <w:pPr>
               <w:jc w:val="center"/>
               <w:rPr>
-                <w:rFonts w:ascii="TH SarabunPSK" w:hAnsi="TH SarabunPSK" w:cs="TH SarabunPSK" w:hint="cs"/>
+                <w:rFonts w:ascii="TH SarabunPSK" w:hAnsi="TH SarabunPSK" w:cs="TH SarabunPSK"/>
                 <w:sz w:val="32"/>
                 <w:szCs w:val="32"/>
               </w:rPr>
@@ -4388,7 +7396,7 @@
             <w:pPr>
               <w:jc w:val="center"/>
               <w:rPr>
-                <w:rFonts w:ascii="TH SarabunPSK" w:hAnsi="TH SarabunPSK" w:cs="TH SarabunPSK" w:hint="cs"/>
+                <w:rFonts w:ascii="TH SarabunPSK" w:hAnsi="TH SarabunPSK" w:cs="TH SarabunPSK"/>
                 <w:sz w:val="32"/>
                 <w:szCs w:val="32"/>
                 <w:cs/>
@@ -4434,7 +7442,6 @@
                 <w:sz w:val="32"/>
                 <w:szCs w:val="32"/>
               </w:rPr>
-              <w:lastRenderedPageBreak/>
               <w:t>23.</w:t>
             </w:r>
           </w:p>
@@ -4593,11 +7600,28 @@
             <w:pPr>
               <w:jc w:val="center"/>
               <w:rPr>
-                <w:rFonts w:ascii="TH SarabunPSK" w:hAnsi="TH SarabunPSK" w:cs="TH SarabunPSK"/>
+                <w:rFonts w:ascii="TH SarabunPSK" w:hAnsi="TH SarabunPSK" w:cs="TH SarabunPSK" w:hint="cs"/>
                 <w:sz w:val="32"/>
                 <w:szCs w:val="32"/>
               </w:rPr>
             </w:pPr>
+            <w:r>
+              <w:rPr>
+                <w:rFonts w:ascii="TH SarabunPSK" w:hAnsi="TH SarabunPSK" w:cs="TH SarabunPSK" w:hint="cs"/>
+                <w:sz w:val="32"/>
+                <w:szCs w:val="32"/>
+                <w:cs/>
+              </w:rPr>
+              <w:t>ตัวต้านทาน 1</w:t>
+            </w:r>
+            <w:r>
+              <w:rPr>
+                <w:rFonts w:ascii="TH SarabunPSK" w:hAnsi="TH SarabunPSK" w:cs="TH SarabunPSK"/>
+                <w:sz w:val="32"/>
+                <w:szCs w:val="32"/>
+              </w:rPr>
+              <w:t>k</w:t>
+            </w:r>
           </w:p>
         </w:tc>
         <w:tc>
@@ -4608,11 +7632,28 @@
             <w:pPr>
               <w:jc w:val="center"/>
               <w:rPr>
-                <w:rFonts w:ascii="TH SarabunPSK" w:hAnsi="TH SarabunPSK" w:cs="TH SarabunPSK"/>
+                <w:rFonts w:ascii="TH SarabunPSK" w:hAnsi="TH SarabunPSK" w:cs="TH SarabunPSK" w:hint="cs"/>
                 <w:sz w:val="32"/>
                 <w:szCs w:val="32"/>
               </w:rPr>
             </w:pPr>
+            <w:r>
+              <w:rPr>
+                <w:rFonts w:ascii="TH SarabunPSK" w:hAnsi="TH SarabunPSK" w:cs="TH SarabunPSK"/>
+                <w:sz w:val="32"/>
+                <w:szCs w:val="32"/>
+              </w:rPr>
+              <w:t>3</w:t>
+            </w:r>
+            <w:r>
+              <w:rPr>
+                <w:rFonts w:ascii="TH SarabunPSK" w:hAnsi="TH SarabunPSK" w:cs="TH SarabunPSK" w:hint="cs"/>
+                <w:sz w:val="32"/>
+                <w:szCs w:val="32"/>
+                <w:cs/>
+              </w:rPr>
+              <w:t xml:space="preserve"> ตัว</w:t>
+            </w:r>
           </w:p>
         </w:tc>
       </w:tr>
@@ -4654,6 +7695,32 @@
                 <w:szCs w:val="32"/>
               </w:rPr>
             </w:pPr>
+            <w:r>
+              <w:rPr>
+                <w:rFonts w:ascii="TH SarabunPSK" w:hAnsi="TH SarabunPSK" w:cs="TH SarabunPSK"/>
+                <w:sz w:val="32"/>
+                <w:szCs w:val="32"/>
+              </w:rPr>
+              <w:t xml:space="preserve">shield for ESP32 Development Board Wireless </w:t>
+            </w:r>
+            <w:proofErr w:type="spellStart"/>
+            <w:r>
+              <w:rPr>
+                <w:rFonts w:ascii="TH SarabunPSK" w:hAnsi="TH SarabunPSK" w:cs="TH SarabunPSK"/>
+                <w:sz w:val="32"/>
+                <w:szCs w:val="32"/>
+              </w:rPr>
+              <w:t>WiFi</w:t>
+            </w:r>
+            <w:proofErr w:type="spellEnd"/>
+            <w:r>
+              <w:rPr>
+                <w:rFonts w:ascii="TH SarabunPSK" w:hAnsi="TH SarabunPSK" w:cs="TH SarabunPSK"/>
+                <w:sz w:val="32"/>
+                <w:szCs w:val="32"/>
+              </w:rPr>
+              <w:t xml:space="preserve"> Bluetooth module Dual Core 38Pin</w:t>
+            </w:r>
           </w:p>
         </w:tc>
         <w:tc>
@@ -4664,11 +7731,29 @@
             <w:pPr>
               <w:jc w:val="center"/>
               <w:rPr>
-                <w:rFonts w:ascii="TH SarabunPSK" w:hAnsi="TH SarabunPSK" w:cs="TH SarabunPSK"/>
-                <w:sz w:val="32"/>
-                <w:szCs w:val="32"/>
+                <w:rFonts w:ascii="TH SarabunPSK" w:hAnsi="TH SarabunPSK" w:cs="TH SarabunPSK" w:hint="cs"/>
+                <w:sz w:val="32"/>
+                <w:szCs w:val="32"/>
+                <w:cs/>
               </w:rPr>
             </w:pPr>
+            <w:r>
+              <w:rPr>
+                <w:rFonts w:ascii="TH SarabunPSK" w:hAnsi="TH SarabunPSK" w:cs="TH SarabunPSK"/>
+                <w:sz w:val="32"/>
+                <w:szCs w:val="32"/>
+              </w:rPr>
+              <w:t>1</w:t>
+            </w:r>
+            <w:r>
+              <w:rPr>
+                <w:rFonts w:ascii="TH SarabunPSK" w:hAnsi="TH SarabunPSK" w:cs="TH SarabunPSK" w:hint="cs"/>
+                <w:sz w:val="32"/>
+                <w:szCs w:val="32"/>
+                <w:cs/>
+              </w:rPr>
+              <w:t xml:space="preserve"> ตัว</w:t>
+            </w:r>
           </w:p>
         </w:tc>
       </w:tr>
@@ -4745,7 +7830,7 @@
         <w:ind w:left="360"/>
         <w:jc w:val="center"/>
         <w:rPr>
-          <w:rFonts w:ascii="TH SarabunPSK" w:hAnsi="TH SarabunPSK" w:cs="TH SarabunPSK" w:hint="cs"/>
+          <w:rFonts w:ascii="TH SarabunPSK" w:hAnsi="TH SarabunPSK" w:cs="TH SarabunPSK"/>
           <w:b/>
           <w:bCs/>
           <w:sz w:val="40"/>
@@ -4755,7 +7840,7 @@
       </w:pPr>
     </w:p>
     <w:sectPr>
-      <w:headerReference w:type="default" r:id="rId11"/>
+      <w:headerReference w:type="default" r:id="rId20"/>
       <w:pgSz w:w="11906" w:h="16838"/>
       <w:pgMar w:top="1440" w:right="1440" w:bottom="1440" w:left="1440" w:header="708" w:footer="708" w:gutter="0"/>
       <w:pgNumType w:start="1"/>
@@ -6548,6 +9633,96 @@
     </w:lvl>
   </w:abstractNum>
   <w:abstractNum w:abstractNumId="14" w15:restartNumberingAfterBreak="0">
+    <w:nsid w:val="299F6140"/>
+    <w:multiLevelType w:val="hybridMultilevel"/>
+    <w:tmpl w:val="5FDC0C3E"/>
+    <w:lvl w:ilvl="0" w:tplc="4AA86E98">
+      <w:start w:val="1"/>
+      <w:numFmt w:val="decimal"/>
+      <w:lvlText w:val="%1."/>
+      <w:lvlJc w:val="left"/>
+      <w:pPr>
+        <w:ind w:left="720" w:hanging="360"/>
+      </w:pPr>
+      <w:rPr>
+        <w:rFonts w:hint="default"/>
+        <w:b/>
+      </w:rPr>
+    </w:lvl>
+    <w:lvl w:ilvl="1" w:tplc="04090019" w:tentative="1">
+      <w:start w:val="1"/>
+      <w:numFmt w:val="lowerLetter"/>
+      <w:lvlText w:val="%2."/>
+      <w:lvlJc w:val="left"/>
+      <w:pPr>
+        <w:ind w:left="1440" w:hanging="360"/>
+      </w:pPr>
+    </w:lvl>
+    <w:lvl w:ilvl="2" w:tplc="0409001B" w:tentative="1">
+      <w:start w:val="1"/>
+      <w:numFmt w:val="lowerRoman"/>
+      <w:lvlText w:val="%3."/>
+      <w:lvlJc w:val="right"/>
+      <w:pPr>
+        <w:ind w:left="2160" w:hanging="180"/>
+      </w:pPr>
+    </w:lvl>
+    <w:lvl w:ilvl="3" w:tplc="0409000F" w:tentative="1">
+      <w:start w:val="1"/>
+      <w:numFmt w:val="decimal"/>
+      <w:lvlText w:val="%4."/>
+      <w:lvlJc w:val="left"/>
+      <w:pPr>
+        <w:ind w:left="2880" w:hanging="360"/>
+      </w:pPr>
+    </w:lvl>
+    <w:lvl w:ilvl="4" w:tplc="04090019" w:tentative="1">
+      <w:start w:val="1"/>
+      <w:numFmt w:val="lowerLetter"/>
+      <w:lvlText w:val="%5."/>
+      <w:lvlJc w:val="left"/>
+      <w:pPr>
+        <w:ind w:left="3600" w:hanging="360"/>
+      </w:pPr>
+    </w:lvl>
+    <w:lvl w:ilvl="5" w:tplc="0409001B" w:tentative="1">
+      <w:start w:val="1"/>
+      <w:numFmt w:val="lowerRoman"/>
+      <w:lvlText w:val="%6."/>
+      <w:lvlJc w:val="right"/>
+      <w:pPr>
+        <w:ind w:left="4320" w:hanging="180"/>
+      </w:pPr>
+    </w:lvl>
+    <w:lvl w:ilvl="6" w:tplc="0409000F" w:tentative="1">
+      <w:start w:val="1"/>
+      <w:numFmt w:val="decimal"/>
+      <w:lvlText w:val="%7."/>
+      <w:lvlJc w:val="left"/>
+      <w:pPr>
+        <w:ind w:left="5040" w:hanging="360"/>
+      </w:pPr>
+    </w:lvl>
+    <w:lvl w:ilvl="7" w:tplc="04090019" w:tentative="1">
+      <w:start w:val="1"/>
+      <w:numFmt w:val="lowerLetter"/>
+      <w:lvlText w:val="%8."/>
+      <w:lvlJc w:val="left"/>
+      <w:pPr>
+        <w:ind w:left="5760" w:hanging="360"/>
+      </w:pPr>
+    </w:lvl>
+    <w:lvl w:ilvl="8" w:tplc="0409001B" w:tentative="1">
+      <w:start w:val="1"/>
+      <w:numFmt w:val="lowerRoman"/>
+      <w:lvlText w:val="%9."/>
+      <w:lvlJc w:val="right"/>
+      <w:pPr>
+        <w:ind w:left="6480" w:hanging="180"/>
+      </w:pPr>
+    </w:lvl>
+  </w:abstractNum>
+  <w:abstractNum w:abstractNumId="15" w15:restartNumberingAfterBreak="0">
     <w:nsid w:val="36C27DB8"/>
     <w:multiLevelType w:val="hybridMultilevel"/>
     <w:tmpl w:val="DBFE18DA"/>
@@ -6660,7 +9835,7 @@
       </w:rPr>
     </w:lvl>
   </w:abstractNum>
-  <w:abstractNum w:abstractNumId="15" w15:restartNumberingAfterBreak="0">
+  <w:abstractNum w:abstractNumId="16" w15:restartNumberingAfterBreak="0">
     <w:nsid w:val="3E057650"/>
     <w:multiLevelType w:val="hybridMultilevel"/>
     <w:tmpl w:val="1BE0C372"/>
@@ -6773,7 +9948,7 @@
       </w:rPr>
     </w:lvl>
   </w:abstractNum>
-  <w:abstractNum w:abstractNumId="16" w15:restartNumberingAfterBreak="0">
+  <w:abstractNum w:abstractNumId="17" w15:restartNumberingAfterBreak="0">
     <w:nsid w:val="48A05AB1"/>
     <w:multiLevelType w:val="hybridMultilevel"/>
     <w:tmpl w:val="F0BE54EE"/>
@@ -6864,7 +10039,7 @@
       </w:pPr>
     </w:lvl>
   </w:abstractNum>
-  <w:abstractNum w:abstractNumId="17" w15:restartNumberingAfterBreak="0">
+  <w:abstractNum w:abstractNumId="18" w15:restartNumberingAfterBreak="0">
     <w:nsid w:val="4E6D6676"/>
     <w:multiLevelType w:val="hybridMultilevel"/>
     <w:tmpl w:val="D416FAEE"/>
@@ -6977,7 +10152,7 @@
       </w:rPr>
     </w:lvl>
   </w:abstractNum>
-  <w:abstractNum w:abstractNumId="18" w15:restartNumberingAfterBreak="0">
+  <w:abstractNum w:abstractNumId="19" w15:restartNumberingAfterBreak="0">
     <w:nsid w:val="5F2C54E7"/>
     <w:multiLevelType w:val="hybridMultilevel"/>
     <w:tmpl w:val="5B0A21EC"/>
@@ -7090,7 +10265,7 @@
       </w:rPr>
     </w:lvl>
   </w:abstractNum>
-  <w:abstractNum w:abstractNumId="19" w15:restartNumberingAfterBreak="0">
+  <w:abstractNum w:abstractNumId="20" w15:restartNumberingAfterBreak="0">
     <w:nsid w:val="64293A1C"/>
     <w:multiLevelType w:val="hybridMultilevel"/>
     <w:tmpl w:val="EF80805A"/>
@@ -7205,7 +10380,7 @@
       </w:rPr>
     </w:lvl>
   </w:abstractNum>
-  <w:abstractNum w:abstractNumId="20" w15:restartNumberingAfterBreak="0">
+  <w:abstractNum w:abstractNumId="21" w15:restartNumberingAfterBreak="0">
     <w:nsid w:val="67C131BA"/>
     <w:multiLevelType w:val="hybridMultilevel"/>
     <w:tmpl w:val="F2847AC2"/>
@@ -7318,7 +10493,7 @@
       </w:rPr>
     </w:lvl>
   </w:abstractNum>
-  <w:abstractNum w:abstractNumId="21" w15:restartNumberingAfterBreak="0">
+  <w:abstractNum w:abstractNumId="22" w15:restartNumberingAfterBreak="0">
     <w:nsid w:val="6CBD53E5"/>
     <w:multiLevelType w:val="multilevel"/>
     <w:tmpl w:val="7316B1EC"/>
@@ -7435,7 +10610,7 @@
       </w:pPr>
     </w:lvl>
   </w:abstractNum>
-  <w:abstractNum w:abstractNumId="22" w15:restartNumberingAfterBreak="0">
+  <w:abstractNum w:abstractNumId="23" w15:restartNumberingAfterBreak="0">
     <w:nsid w:val="6D774F4B"/>
     <w:multiLevelType w:val="hybridMultilevel"/>
     <w:tmpl w:val="0234E1F0"/>
@@ -7548,7 +10723,7 @@
       </w:rPr>
     </w:lvl>
   </w:abstractNum>
-  <w:abstractNum w:abstractNumId="23" w15:restartNumberingAfterBreak="0">
+  <w:abstractNum w:abstractNumId="24" w15:restartNumberingAfterBreak="0">
     <w:nsid w:val="6FB36304"/>
     <w:multiLevelType w:val="hybridMultilevel"/>
     <w:tmpl w:val="6D2ED576"/>
@@ -7661,7 +10836,7 @@
       </w:rPr>
     </w:lvl>
   </w:abstractNum>
-  <w:abstractNum w:abstractNumId="24" w15:restartNumberingAfterBreak="0">
+  <w:abstractNum w:abstractNumId="25" w15:restartNumberingAfterBreak="0">
     <w:nsid w:val="711B76AD"/>
     <w:multiLevelType w:val="hybridMultilevel"/>
     <w:tmpl w:val="1BB674AA"/>
@@ -7747,7 +10922,7 @@
       </w:pPr>
     </w:lvl>
   </w:abstractNum>
-  <w:abstractNum w:abstractNumId="25" w15:restartNumberingAfterBreak="0">
+  <w:abstractNum w:abstractNumId="26" w15:restartNumberingAfterBreak="0">
     <w:nsid w:val="769E5AE7"/>
     <w:multiLevelType w:val="hybridMultilevel"/>
     <w:tmpl w:val="2A5A26C4"/>
@@ -7860,7 +11035,7 @@
       </w:rPr>
     </w:lvl>
   </w:abstractNum>
-  <w:abstractNum w:abstractNumId="26" w15:restartNumberingAfterBreak="0">
+  <w:abstractNum w:abstractNumId="27" w15:restartNumberingAfterBreak="0">
     <w:nsid w:val="79F75B3E"/>
     <w:multiLevelType w:val="hybridMultilevel"/>
     <w:tmpl w:val="A4281A60"/>
@@ -7950,7 +11125,7 @@
       </w:pPr>
     </w:lvl>
   </w:abstractNum>
-  <w:abstractNum w:abstractNumId="27" w15:restartNumberingAfterBreak="0">
+  <w:abstractNum w:abstractNumId="28" w15:restartNumberingAfterBreak="0">
     <w:nsid w:val="7D86541F"/>
     <w:multiLevelType w:val="hybridMultilevel"/>
     <w:tmpl w:val="146A9C2E"/>
@@ -8064,7 +11239,7 @@
     </w:lvl>
   </w:abstractNum>
   <w:num w:numId="1">
-    <w:abstractNumId w:val="26"/>
+    <w:abstractNumId w:val="27"/>
   </w:num>
   <w:num w:numId="2">
     <w:abstractNumId w:val="7"/>
@@ -8073,10 +11248,10 @@
     <w:abstractNumId w:val="1"/>
   </w:num>
   <w:num w:numId="4">
-    <w:abstractNumId w:val="19"/>
+    <w:abstractNumId w:val="20"/>
   </w:num>
   <w:num w:numId="5">
-    <w:abstractNumId w:val="16"/>
+    <w:abstractNumId w:val="17"/>
   </w:num>
   <w:num w:numId="6">
     <w:abstractNumId w:val="8"/>
@@ -8094,40 +11269,40 @@
     <w:abstractNumId w:val="9"/>
   </w:num>
   <w:num w:numId="11">
-    <w:abstractNumId w:val="24"/>
+    <w:abstractNumId w:val="25"/>
   </w:num>
   <w:num w:numId="12">
     <w:abstractNumId w:val="11"/>
   </w:num>
   <w:num w:numId="13">
-    <w:abstractNumId w:val="23"/>
+    <w:abstractNumId w:val="24"/>
   </w:num>
   <w:num w:numId="14">
-    <w:abstractNumId w:val="21"/>
+    <w:abstractNumId w:val="22"/>
   </w:num>
   <w:num w:numId="15">
-    <w:abstractNumId w:val="15"/>
+    <w:abstractNumId w:val="16"/>
   </w:num>
   <w:num w:numId="16">
-    <w:abstractNumId w:val="22"/>
+    <w:abstractNumId w:val="23"/>
   </w:num>
   <w:num w:numId="17">
     <w:abstractNumId w:val="12"/>
   </w:num>
   <w:num w:numId="18">
-    <w:abstractNumId w:val="27"/>
+    <w:abstractNumId w:val="28"/>
   </w:num>
   <w:num w:numId="19">
-    <w:abstractNumId w:val="20"/>
+    <w:abstractNumId w:val="21"/>
   </w:num>
   <w:num w:numId="20">
     <w:abstractNumId w:val="4"/>
   </w:num>
   <w:num w:numId="21">
-    <w:abstractNumId w:val="17"/>
+    <w:abstractNumId w:val="18"/>
   </w:num>
   <w:num w:numId="22">
-    <w:abstractNumId w:val="25"/>
+    <w:abstractNumId w:val="26"/>
   </w:num>
   <w:num w:numId="23">
     <w:abstractNumId w:val="13"/>
@@ -8136,16 +11311,19 @@
     <w:abstractNumId w:val="10"/>
   </w:num>
   <w:num w:numId="25">
-    <w:abstractNumId w:val="18"/>
+    <w:abstractNumId w:val="19"/>
   </w:num>
   <w:num w:numId="26">
-    <w:abstractNumId w:val="14"/>
+    <w:abstractNumId w:val="15"/>
   </w:num>
   <w:num w:numId="27">
     <w:abstractNumId w:val="2"/>
   </w:num>
   <w:num w:numId="28">
     <w:abstractNumId w:val="5"/>
+  </w:num>
+  <w:num w:numId="29">
+    <w:abstractNumId w:val="14"/>
   </w:num>
 </w:numbering>
 </file>

</xml_diff>